<commit_message>
primeira emissão estatutos associativos
</commit_message>
<xml_diff>
--- a/DRIVE/1. Direção/0. Associativo/Estatutos e Regulamento Interno/Estatutos/Estatutos v1.0.docx
+++ b/DRIVE/1. Direção/0. Associativo/Estatutos e Regulamento Interno/Estatutos/Estatutos v1.0.docx
@@ -4,25 +4,88 @@
   <w:body>
     <w:p>
       <w:pPr>
-        <w:rPr>
-          <w:lang w:val="pt-PT"/>
-        </w:rPr>
-      </w:pPr>
-      <w:r>
-        <w:rPr>
-          <w:lang w:val="pt-PT"/>
-        </w:rPr>
-        <w:t>MSET</w:t>
-      </w:r>
-    </w:p>
-    <w:p>
-      <w:pPr>
-        <w:rPr>
-          <w:lang w:val="pt-PT"/>
-        </w:rPr>
-      </w:pPr>
-      <w:r>
-        <w:rPr>
+        <w:pStyle w:val="Title"/>
+        <w:jc w:val="center"/>
+        <w:rPr>
+          <w:lang w:val="pt-PT"/>
+        </w:rPr>
+      </w:pPr>
+    </w:p>
+    <w:p>
+      <w:pPr>
+        <w:pStyle w:val="Title"/>
+        <w:jc w:val="center"/>
+        <w:rPr>
+          <w:lang w:val="pt-PT"/>
+        </w:rPr>
+      </w:pPr>
+    </w:p>
+    <w:p>
+      <w:pPr>
+        <w:pStyle w:val="Title"/>
+        <w:jc w:val="center"/>
+        <w:rPr>
+          <w:lang w:val="pt-PT"/>
+        </w:rPr>
+      </w:pPr>
+    </w:p>
+    <w:p>
+      <w:pPr>
+        <w:pStyle w:val="Title"/>
+        <w:jc w:val="center"/>
+        <w:rPr>
+          <w:lang w:val="pt-PT"/>
+        </w:rPr>
+      </w:pPr>
+    </w:p>
+    <w:p>
+      <w:pPr>
+        <w:pStyle w:val="Title"/>
+        <w:jc w:val="center"/>
+        <w:rPr>
+          <w:sz w:val="96"/>
+          <w:szCs w:val="96"/>
+          <w:lang w:val="pt-PT"/>
+        </w:rPr>
+      </w:pPr>
+      <w:r>
+        <w:rPr>
+          <w:sz w:val="96"/>
+          <w:szCs w:val="96"/>
+          <w:lang w:val="pt-PT"/>
+        </w:rPr>
+        <w:t>M</w:t>
+      </w:r>
+      <w:r>
+        <w:rPr>
+          <w:sz w:val="96"/>
+          <w:szCs w:val="96"/>
+          <w:lang w:val="pt-PT"/>
+        </w:rPr>
+        <w:t>IND</w:t>
+      </w:r>
+      <w:r>
+        <w:rPr>
+          <w:sz w:val="96"/>
+          <w:szCs w:val="96"/>
+          <w:lang w:val="pt-PT"/>
+        </w:rPr>
+        <w:t>SET</w:t>
+      </w:r>
+    </w:p>
+    <w:p>
+      <w:pPr>
+        <w:jc w:val="center"/>
+        <w:rPr>
+          <w:sz w:val="40"/>
+          <w:szCs w:val="40"/>
+          <w:lang w:val="pt-PT"/>
+        </w:rPr>
+      </w:pPr>
+      <w:r>
+        <w:rPr>
+          <w:sz w:val="40"/>
+          <w:szCs w:val="40"/>
           <w:lang w:val="pt-PT"/>
         </w:rPr>
         <w:t>ESTATUTOS ASSOCIATIVOS MSET</w:t>
@@ -30,12 +93,17 @@
     </w:p>
     <w:p>
       <w:pPr>
-        <w:rPr>
-          <w:lang w:val="pt-PT"/>
-        </w:rPr>
-      </w:pPr>
-      <w:r>
-        <w:rPr>
+        <w:jc w:val="center"/>
+        <w:rPr>
+          <w:sz w:val="36"/>
+          <w:szCs w:val="36"/>
+          <w:lang w:val="pt-PT"/>
+        </w:rPr>
+      </w:pPr>
+      <w:r>
+        <w:rPr>
+          <w:sz w:val="36"/>
+          <w:szCs w:val="36"/>
           <w:lang w:val="pt-PT"/>
         </w:rPr>
         <w:t>PROPOSTA</w:t>
@@ -43,25 +111,17 @@
     </w:p>
     <w:p>
       <w:pPr>
-        <w:rPr>
-          <w:lang w:val="pt-PT"/>
-        </w:rPr>
-      </w:pPr>
-      <w:r>
-        <w:rPr>
-          <w:lang w:val="pt-PT"/>
-        </w:rPr>
-        <w:t>ASSOCIATIVO</w:t>
-      </w:r>
-    </w:p>
-    <w:p>
-      <w:pPr>
-        <w:rPr>
-          <w:lang w:val="pt-PT"/>
-        </w:rPr>
-      </w:pPr>
-      <w:r>
-        <w:rPr>
+        <w:jc w:val="center"/>
+        <w:rPr>
+          <w:sz w:val="32"/>
+          <w:szCs w:val="32"/>
+          <w:lang w:val="pt-PT"/>
+        </w:rPr>
+      </w:pPr>
+      <w:r>
+        <w:rPr>
+          <w:sz w:val="32"/>
+          <w:szCs w:val="32"/>
           <w:lang w:val="pt-PT"/>
         </w:rPr>
         <w:t>RUI ALVES</w:t>
@@ -69,6 +129,7 @@
     </w:p>
     <w:p>
       <w:pPr>
+        <w:jc w:val="center"/>
         <w:rPr>
           <w:lang w:val="pt-PT"/>
         </w:rPr>
@@ -82,6 +143,7 @@
     </w:p>
     <w:p>
       <w:pPr>
+        <w:jc w:val="center"/>
         <w:rPr>
           <w:lang w:val="pt-PT"/>
         </w:rPr>
@@ -204,13 +266,16 @@
               <w:cnfStyle w:val="000000000000" w:firstRow="0" w:lastRow="0" w:firstColumn="0" w:lastColumn="0" w:oddVBand="0" w:evenVBand="0" w:oddHBand="0" w:evenHBand="0" w:firstRowFirstColumn="0" w:firstRowLastColumn="0" w:lastRowFirstColumn="0" w:lastRowLastColumn="0"/>
             </w:pPr>
             <w:r>
-              <w:t>02</w:t>
+              <w:t>26</w:t>
             </w:r>
             <w:r>
               <w:t>/</w:t>
             </w:r>
             <w:r>
-              <w:t>02</w:t>
+              <w:t>0</w:t>
+            </w:r>
+            <w:r>
+              <w:t>7</w:t>
             </w:r>
             <w:r>
               <w:t>/</w:t>
@@ -485,17 +550,6 @@
     </w:p>
     <w:p>
       <w:pPr>
-        <w:pStyle w:val="21QDCLIENTEDESIGNAODOPROJETO"/>
-        <w:ind w:left="0"/>
-        <w:jc w:val="left"/>
-      </w:pPr>
-      <w:r>
-        <w:lastRenderedPageBreak/>
-        <w:t>indice</w:t>
-      </w:r>
-    </w:p>
-    <w:p>
-      <w:pPr>
         <w:rPr>
           <w:rFonts w:ascii="Calibri" w:eastAsia="Times New Roman" w:hAnsi="Calibri" w:cs="Calibri"/>
           <w:b/>
@@ -508,57 +562,2396 @@
         </w:rPr>
       </w:pPr>
       <w:r>
+        <w:lastRenderedPageBreak/>
         <w:br w:type="page"/>
       </w:r>
     </w:p>
-    <w:p>
-      <w:pPr>
-        <w:pStyle w:val="21QDCLIENTEDESIGNAODOPROJETO"/>
-      </w:pPr>
+    <w:sdt>
+      <w:sdtPr>
+        <w:id w:val="276294613"/>
+        <w:docPartObj>
+          <w:docPartGallery w:val="Table of Contents"/>
+          <w:docPartUnique/>
+        </w:docPartObj>
+      </w:sdtPr>
+      <w:sdtEndPr>
+        <w:rPr>
+          <w:rFonts w:asciiTheme="minorHAnsi" w:eastAsiaTheme="minorHAnsi" w:hAnsiTheme="minorHAnsi" w:cstheme="minorBidi"/>
+          <w:b/>
+          <w:bCs/>
+          <w:noProof/>
+          <w:color w:val="auto"/>
+          <w:kern w:val="2"/>
+          <w:sz w:val="24"/>
+          <w:szCs w:val="24"/>
+          <w:lang w:val="en-GB"/>
+          <w14:ligatures w14:val="standardContextual"/>
+        </w:rPr>
+      </w:sdtEndPr>
+      <w:sdtContent>
+        <w:p>
+          <w:pPr>
+            <w:pStyle w:val="TOCHeading"/>
+            <w:spacing w:after="240"/>
+            <w:rPr>
+              <w:rStyle w:val="TitleChar"/>
+              <w:color w:val="auto"/>
+            </w:rPr>
+          </w:pPr>
+          <w:r>
+            <w:rPr>
+              <w:rStyle w:val="TitleChar"/>
+              <w:color w:val="auto"/>
+            </w:rPr>
+            <w:t>Índice</w:t>
+          </w:r>
+        </w:p>
+        <w:p>
+          <w:pPr>
+            <w:pStyle w:val="TOC1"/>
+            <w:tabs>
+              <w:tab w:val="left" w:pos="1440"/>
+              <w:tab w:val="right" w:leader="dot" w:pos="10456"/>
+            </w:tabs>
+            <w:rPr>
+              <w:rFonts w:eastAsiaTheme="minorEastAsia"/>
+              <w:noProof/>
+              <w:lang w:eastAsia="en-GB"/>
+            </w:rPr>
+          </w:pPr>
+          <w:r>
+            <w:fldChar w:fldCharType="begin"/>
+          </w:r>
+          <w:r>
+            <w:instrText xml:space="preserve"> TOC \o "1-2" \h \z \u </w:instrText>
+          </w:r>
+          <w:r>
+            <w:fldChar w:fldCharType="separate"/>
+          </w:r>
+          <w:hyperlink w:anchor="_Toc236000089" w:history="1">
+            <w:r>
+              <w:rPr>
+                <w:rStyle w:val="Hyperlink"/>
+                <w:noProof/>
+              </w:rPr>
+              <w:t>Capítulo 1º</w:t>
+            </w:r>
+            <w:r>
+              <w:rPr>
+                <w:rFonts w:eastAsiaTheme="minorEastAsia"/>
+                <w:noProof/>
+                <w:lang w:eastAsia="en-GB"/>
+              </w:rPr>
+              <w:tab/>
+            </w:r>
+            <w:r>
+              <w:rPr>
+                <w:rStyle w:val="Hyperlink"/>
+                <w:noProof/>
+              </w:rPr>
+              <w:t>GENERALIDADES</w:t>
+            </w:r>
+            <w:r>
+              <w:rPr>
+                <w:noProof/>
+                <w:webHidden/>
+              </w:rPr>
+              <w:tab/>
+            </w:r>
+            <w:r>
+              <w:rPr>
+                <w:noProof/>
+                <w:webHidden/>
+              </w:rPr>
+              <w:fldChar w:fldCharType="begin"/>
+            </w:r>
+            <w:r>
+              <w:rPr>
+                <w:noProof/>
+                <w:webHidden/>
+              </w:rPr>
+              <w:instrText xml:space="preserve"> PAGEREF _Toc236000089 \h </w:instrText>
+            </w:r>
+            <w:r>
+              <w:rPr>
+                <w:noProof/>
+                <w:webHidden/>
+              </w:rPr>
+            </w:r>
+            <w:r>
+              <w:rPr>
+                <w:noProof/>
+                <w:webHidden/>
+              </w:rPr>
+              <w:fldChar w:fldCharType="separate"/>
+            </w:r>
+            <w:r>
+              <w:rPr>
+                <w:noProof/>
+                <w:webHidden/>
+              </w:rPr>
+              <w:t>5</w:t>
+            </w:r>
+            <w:r>
+              <w:rPr>
+                <w:noProof/>
+                <w:webHidden/>
+              </w:rPr>
+              <w:fldChar w:fldCharType="end"/>
+            </w:r>
+          </w:hyperlink>
+        </w:p>
+        <w:p>
+          <w:pPr>
+            <w:pStyle w:val="TOC2"/>
+            <w:tabs>
+              <w:tab w:val="left" w:pos="1440"/>
+              <w:tab w:val="right" w:leader="dot" w:pos="10456"/>
+            </w:tabs>
+            <w:rPr>
+              <w:rFonts w:eastAsiaTheme="minorEastAsia"/>
+              <w:noProof/>
+              <w:lang w:eastAsia="en-GB"/>
+            </w:rPr>
+          </w:pPr>
+          <w:hyperlink w:anchor="_Toc236000090" w:history="1">
+            <w:r>
+              <w:rPr>
+                <w:rStyle w:val="Hyperlink"/>
+                <w:noProof/>
+              </w:rPr>
+              <w:t>Artigo 1º</w:t>
+            </w:r>
+            <w:r>
+              <w:rPr>
+                <w:rFonts w:eastAsiaTheme="minorEastAsia"/>
+                <w:noProof/>
+                <w:lang w:eastAsia="en-GB"/>
+              </w:rPr>
+              <w:tab/>
+            </w:r>
+            <w:r>
+              <w:rPr>
+                <w:rStyle w:val="Hyperlink"/>
+                <w:noProof/>
+              </w:rPr>
+              <w:t>DENOMINAÇÃO, SEDE E DURAÇÃO</w:t>
+            </w:r>
+            <w:r>
+              <w:rPr>
+                <w:noProof/>
+                <w:webHidden/>
+              </w:rPr>
+              <w:tab/>
+            </w:r>
+            <w:r>
+              <w:rPr>
+                <w:noProof/>
+                <w:webHidden/>
+              </w:rPr>
+              <w:fldChar w:fldCharType="begin"/>
+            </w:r>
+            <w:r>
+              <w:rPr>
+                <w:noProof/>
+                <w:webHidden/>
+              </w:rPr>
+              <w:instrText xml:space="preserve"> PAGEREF _Toc236000090 \h </w:instrText>
+            </w:r>
+            <w:r>
+              <w:rPr>
+                <w:noProof/>
+                <w:webHidden/>
+              </w:rPr>
+            </w:r>
+            <w:r>
+              <w:rPr>
+                <w:noProof/>
+                <w:webHidden/>
+              </w:rPr>
+              <w:fldChar w:fldCharType="separate"/>
+            </w:r>
+            <w:r>
+              <w:rPr>
+                <w:noProof/>
+                <w:webHidden/>
+              </w:rPr>
+              <w:t>5</w:t>
+            </w:r>
+            <w:r>
+              <w:rPr>
+                <w:noProof/>
+                <w:webHidden/>
+              </w:rPr>
+              <w:fldChar w:fldCharType="end"/>
+            </w:r>
+          </w:hyperlink>
+        </w:p>
+        <w:p>
+          <w:pPr>
+            <w:pStyle w:val="TOC2"/>
+            <w:tabs>
+              <w:tab w:val="left" w:pos="1440"/>
+              <w:tab w:val="right" w:leader="dot" w:pos="10456"/>
+            </w:tabs>
+            <w:rPr>
+              <w:rFonts w:eastAsiaTheme="minorEastAsia"/>
+              <w:noProof/>
+              <w:lang w:eastAsia="en-GB"/>
+            </w:rPr>
+          </w:pPr>
+          <w:hyperlink w:anchor="_Toc236000091" w:history="1">
+            <w:r>
+              <w:rPr>
+                <w:rStyle w:val="Hyperlink"/>
+                <w:noProof/>
+              </w:rPr>
+              <w:t>Artigo 2º</w:t>
+            </w:r>
+            <w:r>
+              <w:rPr>
+                <w:rFonts w:eastAsiaTheme="minorEastAsia"/>
+                <w:noProof/>
+                <w:lang w:eastAsia="en-GB"/>
+              </w:rPr>
+              <w:tab/>
+            </w:r>
+            <w:r>
+              <w:rPr>
+                <w:rStyle w:val="Hyperlink"/>
+                <w:noProof/>
+              </w:rPr>
+              <w:t>FINS</w:t>
+            </w:r>
+            <w:r>
+              <w:rPr>
+                <w:noProof/>
+                <w:webHidden/>
+              </w:rPr>
+              <w:tab/>
+            </w:r>
+            <w:r>
+              <w:rPr>
+                <w:noProof/>
+                <w:webHidden/>
+              </w:rPr>
+              <w:fldChar w:fldCharType="begin"/>
+            </w:r>
+            <w:r>
+              <w:rPr>
+                <w:noProof/>
+                <w:webHidden/>
+              </w:rPr>
+              <w:instrText xml:space="preserve"> PAGEREF _Toc236000091 \h </w:instrText>
+            </w:r>
+            <w:r>
+              <w:rPr>
+                <w:noProof/>
+                <w:webHidden/>
+              </w:rPr>
+            </w:r>
+            <w:r>
+              <w:rPr>
+                <w:noProof/>
+                <w:webHidden/>
+              </w:rPr>
+              <w:fldChar w:fldCharType="separate"/>
+            </w:r>
+            <w:r>
+              <w:rPr>
+                <w:noProof/>
+                <w:webHidden/>
+              </w:rPr>
+              <w:t>5</w:t>
+            </w:r>
+            <w:r>
+              <w:rPr>
+                <w:noProof/>
+                <w:webHidden/>
+              </w:rPr>
+              <w:fldChar w:fldCharType="end"/>
+            </w:r>
+          </w:hyperlink>
+        </w:p>
+        <w:p>
+          <w:pPr>
+            <w:pStyle w:val="TOC2"/>
+            <w:tabs>
+              <w:tab w:val="left" w:pos="1440"/>
+              <w:tab w:val="right" w:leader="dot" w:pos="10456"/>
+            </w:tabs>
+            <w:rPr>
+              <w:rFonts w:eastAsiaTheme="minorEastAsia"/>
+              <w:noProof/>
+              <w:lang w:eastAsia="en-GB"/>
+            </w:rPr>
+          </w:pPr>
+          <w:hyperlink w:anchor="_Toc236000092" w:history="1">
+            <w:r>
+              <w:rPr>
+                <w:rStyle w:val="Hyperlink"/>
+                <w:noProof/>
+                <w:lang w:val="pt-PT"/>
+              </w:rPr>
+              <w:t>Artigo 3º</w:t>
+            </w:r>
+            <w:r>
+              <w:rPr>
+                <w:rFonts w:eastAsiaTheme="minorEastAsia"/>
+                <w:noProof/>
+                <w:lang w:eastAsia="en-GB"/>
+              </w:rPr>
+              <w:tab/>
+            </w:r>
+            <w:r>
+              <w:rPr>
+                <w:rStyle w:val="Hyperlink"/>
+                <w:noProof/>
+                <w:lang w:val="pt-PT"/>
+              </w:rPr>
+              <w:t>Atividades e meios</w:t>
+            </w:r>
+            <w:r>
+              <w:rPr>
+                <w:noProof/>
+                <w:webHidden/>
+              </w:rPr>
+              <w:tab/>
+            </w:r>
+            <w:r>
+              <w:rPr>
+                <w:noProof/>
+                <w:webHidden/>
+              </w:rPr>
+              <w:fldChar w:fldCharType="begin"/>
+            </w:r>
+            <w:r>
+              <w:rPr>
+                <w:noProof/>
+                <w:webHidden/>
+              </w:rPr>
+              <w:instrText xml:space="preserve"> PAGEREF _Toc236000092 \h </w:instrText>
+            </w:r>
+            <w:r>
+              <w:rPr>
+                <w:noProof/>
+                <w:webHidden/>
+              </w:rPr>
+            </w:r>
+            <w:r>
+              <w:rPr>
+                <w:noProof/>
+                <w:webHidden/>
+              </w:rPr>
+              <w:fldChar w:fldCharType="separate"/>
+            </w:r>
+            <w:r>
+              <w:rPr>
+                <w:noProof/>
+                <w:webHidden/>
+              </w:rPr>
+              <w:t>5</w:t>
+            </w:r>
+            <w:r>
+              <w:rPr>
+                <w:noProof/>
+                <w:webHidden/>
+              </w:rPr>
+              <w:fldChar w:fldCharType="end"/>
+            </w:r>
+          </w:hyperlink>
+        </w:p>
+        <w:p>
+          <w:pPr>
+            <w:pStyle w:val="TOC2"/>
+            <w:tabs>
+              <w:tab w:val="left" w:pos="1440"/>
+              <w:tab w:val="right" w:leader="dot" w:pos="10456"/>
+            </w:tabs>
+            <w:rPr>
+              <w:rFonts w:eastAsiaTheme="minorEastAsia"/>
+              <w:noProof/>
+              <w:lang w:eastAsia="en-GB"/>
+            </w:rPr>
+          </w:pPr>
+          <w:hyperlink w:anchor="_Toc236000093" w:history="1">
+            <w:r>
+              <w:rPr>
+                <w:rStyle w:val="Hyperlink"/>
+                <w:noProof/>
+                <w:lang w:val="pt-PT"/>
+              </w:rPr>
+              <w:t>Artigo 4º</w:t>
+            </w:r>
+            <w:r>
+              <w:rPr>
+                <w:rFonts w:eastAsiaTheme="minorEastAsia"/>
+                <w:noProof/>
+                <w:lang w:eastAsia="en-GB"/>
+              </w:rPr>
+              <w:tab/>
+            </w:r>
+            <w:r>
+              <w:rPr>
+                <w:rStyle w:val="Hyperlink"/>
+                <w:noProof/>
+                <w:lang w:val="pt-PT"/>
+              </w:rPr>
+              <w:t>Ausência de fins lucrativos e não distribuição de resultados</w:t>
+            </w:r>
+            <w:r>
+              <w:rPr>
+                <w:noProof/>
+                <w:webHidden/>
+              </w:rPr>
+              <w:tab/>
+            </w:r>
+            <w:r>
+              <w:rPr>
+                <w:noProof/>
+                <w:webHidden/>
+              </w:rPr>
+              <w:fldChar w:fldCharType="begin"/>
+            </w:r>
+            <w:r>
+              <w:rPr>
+                <w:noProof/>
+                <w:webHidden/>
+              </w:rPr>
+              <w:instrText xml:space="preserve"> PAGEREF _Toc236000093 \h </w:instrText>
+            </w:r>
+            <w:r>
+              <w:rPr>
+                <w:noProof/>
+                <w:webHidden/>
+              </w:rPr>
+            </w:r>
+            <w:r>
+              <w:rPr>
+                <w:noProof/>
+                <w:webHidden/>
+              </w:rPr>
+              <w:fldChar w:fldCharType="separate"/>
+            </w:r>
+            <w:r>
+              <w:rPr>
+                <w:noProof/>
+                <w:webHidden/>
+              </w:rPr>
+              <w:t>6</w:t>
+            </w:r>
+            <w:r>
+              <w:rPr>
+                <w:noProof/>
+                <w:webHidden/>
+              </w:rPr>
+              <w:fldChar w:fldCharType="end"/>
+            </w:r>
+          </w:hyperlink>
+        </w:p>
+        <w:p>
+          <w:pPr>
+            <w:pStyle w:val="TOC2"/>
+            <w:tabs>
+              <w:tab w:val="left" w:pos="1440"/>
+              <w:tab w:val="right" w:leader="dot" w:pos="10456"/>
+            </w:tabs>
+            <w:rPr>
+              <w:rFonts w:eastAsiaTheme="minorEastAsia"/>
+              <w:noProof/>
+              <w:lang w:eastAsia="en-GB"/>
+            </w:rPr>
+          </w:pPr>
+          <w:hyperlink w:anchor="_Toc236000094" w:history="1">
+            <w:r>
+              <w:rPr>
+                <w:rStyle w:val="Hyperlink"/>
+                <w:noProof/>
+                <w:lang w:val="pt-PT"/>
+              </w:rPr>
+              <w:t>Artigo 5º</w:t>
+            </w:r>
+            <w:r>
+              <w:rPr>
+                <w:rFonts w:eastAsiaTheme="minorEastAsia"/>
+                <w:noProof/>
+                <w:lang w:eastAsia="en-GB"/>
+              </w:rPr>
+              <w:tab/>
+            </w:r>
+            <w:r>
+              <w:rPr>
+                <w:rStyle w:val="Hyperlink"/>
+                <w:noProof/>
+                <w:lang w:val="pt-PT"/>
+              </w:rPr>
+              <w:t>Ausência de fins lucrativos e não distribuição de resultados</w:t>
+            </w:r>
+            <w:r>
+              <w:rPr>
+                <w:noProof/>
+                <w:webHidden/>
+              </w:rPr>
+              <w:tab/>
+            </w:r>
+            <w:r>
+              <w:rPr>
+                <w:noProof/>
+                <w:webHidden/>
+              </w:rPr>
+              <w:fldChar w:fldCharType="begin"/>
+            </w:r>
+            <w:r>
+              <w:rPr>
+                <w:noProof/>
+                <w:webHidden/>
+              </w:rPr>
+              <w:instrText xml:space="preserve"> PAGEREF _Toc236000094 \h </w:instrText>
+            </w:r>
+            <w:r>
+              <w:rPr>
+                <w:noProof/>
+                <w:webHidden/>
+              </w:rPr>
+            </w:r>
+            <w:r>
+              <w:rPr>
+                <w:noProof/>
+                <w:webHidden/>
+              </w:rPr>
+              <w:fldChar w:fldCharType="separate"/>
+            </w:r>
+            <w:r>
+              <w:rPr>
+                <w:noProof/>
+                <w:webHidden/>
+              </w:rPr>
+              <w:t>6</w:t>
+            </w:r>
+            <w:r>
+              <w:rPr>
+                <w:noProof/>
+                <w:webHidden/>
+              </w:rPr>
+              <w:fldChar w:fldCharType="end"/>
+            </w:r>
+          </w:hyperlink>
+        </w:p>
+        <w:p>
+          <w:pPr>
+            <w:pStyle w:val="TOC1"/>
+            <w:tabs>
+              <w:tab w:val="left" w:pos="1440"/>
+              <w:tab w:val="right" w:leader="dot" w:pos="10456"/>
+            </w:tabs>
+            <w:rPr>
+              <w:rFonts w:eastAsiaTheme="minorEastAsia"/>
+              <w:noProof/>
+              <w:lang w:eastAsia="en-GB"/>
+            </w:rPr>
+          </w:pPr>
+          <w:hyperlink w:anchor="_Toc236000095" w:history="1">
+            <w:r>
+              <w:rPr>
+                <w:rStyle w:val="Hyperlink"/>
+                <w:noProof/>
+                <w:lang w:val="pt-PT"/>
+              </w:rPr>
+              <w:t>Capítulo 2º</w:t>
+            </w:r>
+            <w:r>
+              <w:rPr>
+                <w:rFonts w:eastAsiaTheme="minorEastAsia"/>
+                <w:noProof/>
+                <w:lang w:eastAsia="en-GB"/>
+              </w:rPr>
+              <w:tab/>
+            </w:r>
+            <w:r>
+              <w:rPr>
+                <w:rStyle w:val="Hyperlink"/>
+                <w:noProof/>
+                <w:lang w:val="pt-PT"/>
+              </w:rPr>
+              <w:t>Associados</w:t>
+            </w:r>
+            <w:r>
+              <w:rPr>
+                <w:noProof/>
+                <w:webHidden/>
+              </w:rPr>
+              <w:tab/>
+            </w:r>
+            <w:r>
+              <w:rPr>
+                <w:noProof/>
+                <w:webHidden/>
+              </w:rPr>
+              <w:fldChar w:fldCharType="begin"/>
+            </w:r>
+            <w:r>
+              <w:rPr>
+                <w:noProof/>
+                <w:webHidden/>
+              </w:rPr>
+              <w:instrText xml:space="preserve"> PAGEREF _Toc236000095 \h </w:instrText>
+            </w:r>
+            <w:r>
+              <w:rPr>
+                <w:noProof/>
+                <w:webHidden/>
+              </w:rPr>
+            </w:r>
+            <w:r>
+              <w:rPr>
+                <w:noProof/>
+                <w:webHidden/>
+              </w:rPr>
+              <w:fldChar w:fldCharType="separate"/>
+            </w:r>
+            <w:r>
+              <w:rPr>
+                <w:noProof/>
+                <w:webHidden/>
+              </w:rPr>
+              <w:t>7</w:t>
+            </w:r>
+            <w:r>
+              <w:rPr>
+                <w:noProof/>
+                <w:webHidden/>
+              </w:rPr>
+              <w:fldChar w:fldCharType="end"/>
+            </w:r>
+          </w:hyperlink>
+        </w:p>
+        <w:p>
+          <w:pPr>
+            <w:pStyle w:val="TOC2"/>
+            <w:tabs>
+              <w:tab w:val="left" w:pos="1440"/>
+              <w:tab w:val="right" w:leader="dot" w:pos="10456"/>
+            </w:tabs>
+            <w:rPr>
+              <w:rFonts w:eastAsiaTheme="minorEastAsia"/>
+              <w:noProof/>
+              <w:lang w:eastAsia="en-GB"/>
+            </w:rPr>
+          </w:pPr>
+          <w:hyperlink w:anchor="_Toc236000096" w:history="1">
+            <w:r>
+              <w:rPr>
+                <w:rStyle w:val="Hyperlink"/>
+                <w:noProof/>
+                <w:lang w:val="pt-PT"/>
+              </w:rPr>
+              <w:t>Artigo 6º</w:t>
+            </w:r>
+            <w:r>
+              <w:rPr>
+                <w:rFonts w:eastAsiaTheme="minorEastAsia"/>
+                <w:noProof/>
+                <w:lang w:eastAsia="en-GB"/>
+              </w:rPr>
+              <w:tab/>
+            </w:r>
+            <w:r>
+              <w:rPr>
+                <w:rStyle w:val="Hyperlink"/>
+                <w:noProof/>
+                <w:lang w:val="pt-PT"/>
+              </w:rPr>
+              <w:t>Categorias de associa</w:t>
+            </w:r>
+            <w:r>
+              <w:rPr>
+                <w:rStyle w:val="Hyperlink"/>
+                <w:noProof/>
+                <w:lang w:val="pt-PT"/>
+              </w:rPr>
+              <w:t>d</w:t>
+            </w:r>
+            <w:r>
+              <w:rPr>
+                <w:rStyle w:val="Hyperlink"/>
+                <w:noProof/>
+                <w:lang w:val="pt-PT"/>
+              </w:rPr>
+              <w:t>os~</w:t>
+            </w:r>
+            <w:r>
+              <w:rPr>
+                <w:noProof/>
+                <w:webHidden/>
+              </w:rPr>
+              <w:tab/>
+            </w:r>
+            <w:r>
+              <w:rPr>
+                <w:noProof/>
+                <w:webHidden/>
+              </w:rPr>
+              <w:fldChar w:fldCharType="begin"/>
+            </w:r>
+            <w:r>
+              <w:rPr>
+                <w:noProof/>
+                <w:webHidden/>
+              </w:rPr>
+              <w:instrText xml:space="preserve"> PAGEREF _Toc236000096 \h </w:instrText>
+            </w:r>
+            <w:r>
+              <w:rPr>
+                <w:noProof/>
+                <w:webHidden/>
+              </w:rPr>
+            </w:r>
+            <w:r>
+              <w:rPr>
+                <w:noProof/>
+                <w:webHidden/>
+              </w:rPr>
+              <w:fldChar w:fldCharType="separate"/>
+            </w:r>
+            <w:r>
+              <w:rPr>
+                <w:noProof/>
+                <w:webHidden/>
+              </w:rPr>
+              <w:t>7</w:t>
+            </w:r>
+            <w:r>
+              <w:rPr>
+                <w:noProof/>
+                <w:webHidden/>
+              </w:rPr>
+              <w:fldChar w:fldCharType="end"/>
+            </w:r>
+          </w:hyperlink>
+        </w:p>
+        <w:p>
+          <w:pPr>
+            <w:pStyle w:val="TOC2"/>
+            <w:tabs>
+              <w:tab w:val="left" w:pos="1440"/>
+              <w:tab w:val="right" w:leader="dot" w:pos="10456"/>
+            </w:tabs>
+            <w:rPr>
+              <w:rFonts w:eastAsiaTheme="minorEastAsia"/>
+              <w:noProof/>
+              <w:lang w:eastAsia="en-GB"/>
+            </w:rPr>
+          </w:pPr>
+          <w:hyperlink w:anchor="_Toc236000097" w:history="1">
+            <w:r>
+              <w:rPr>
+                <w:rStyle w:val="Hyperlink"/>
+                <w:noProof/>
+                <w:lang w:val="pt-PT"/>
+              </w:rPr>
+              <w:t>Artigo 7º</w:t>
+            </w:r>
+            <w:r>
+              <w:rPr>
+                <w:rFonts w:eastAsiaTheme="minorEastAsia"/>
+                <w:noProof/>
+                <w:lang w:eastAsia="en-GB"/>
+              </w:rPr>
+              <w:tab/>
+            </w:r>
+            <w:r>
+              <w:rPr>
+                <w:rStyle w:val="Hyperlink"/>
+                <w:noProof/>
+                <w:lang w:val="pt-PT"/>
+              </w:rPr>
+              <w:t>Admissão</w:t>
+            </w:r>
+            <w:r>
+              <w:rPr>
+                <w:noProof/>
+                <w:webHidden/>
+              </w:rPr>
+              <w:tab/>
+            </w:r>
+            <w:r>
+              <w:rPr>
+                <w:noProof/>
+                <w:webHidden/>
+              </w:rPr>
+              <w:fldChar w:fldCharType="begin"/>
+            </w:r>
+            <w:r>
+              <w:rPr>
+                <w:noProof/>
+                <w:webHidden/>
+              </w:rPr>
+              <w:instrText xml:space="preserve"> PAGEREF _Toc236000097 \h </w:instrText>
+            </w:r>
+            <w:r>
+              <w:rPr>
+                <w:noProof/>
+                <w:webHidden/>
+              </w:rPr>
+            </w:r>
+            <w:r>
+              <w:rPr>
+                <w:noProof/>
+                <w:webHidden/>
+              </w:rPr>
+              <w:fldChar w:fldCharType="separate"/>
+            </w:r>
+            <w:r>
+              <w:rPr>
+                <w:noProof/>
+                <w:webHidden/>
+              </w:rPr>
+              <w:t>7</w:t>
+            </w:r>
+            <w:r>
+              <w:rPr>
+                <w:noProof/>
+                <w:webHidden/>
+              </w:rPr>
+              <w:fldChar w:fldCharType="end"/>
+            </w:r>
+          </w:hyperlink>
+        </w:p>
+        <w:p>
+          <w:pPr>
+            <w:pStyle w:val="TOC2"/>
+            <w:tabs>
+              <w:tab w:val="left" w:pos="1440"/>
+              <w:tab w:val="right" w:leader="dot" w:pos="10456"/>
+            </w:tabs>
+            <w:rPr>
+              <w:rFonts w:eastAsiaTheme="minorEastAsia"/>
+              <w:noProof/>
+              <w:lang w:eastAsia="en-GB"/>
+            </w:rPr>
+          </w:pPr>
+          <w:hyperlink w:anchor="_Toc236000098" w:history="1">
+            <w:r>
+              <w:rPr>
+                <w:rStyle w:val="Hyperlink"/>
+                <w:noProof/>
+                <w:lang w:val="pt-PT"/>
+              </w:rPr>
+              <w:t>Artigo 8º</w:t>
+            </w:r>
+            <w:r>
+              <w:rPr>
+                <w:rFonts w:eastAsiaTheme="minorEastAsia"/>
+                <w:noProof/>
+                <w:lang w:eastAsia="en-GB"/>
+              </w:rPr>
+              <w:tab/>
+            </w:r>
+            <w:r>
+              <w:rPr>
+                <w:rStyle w:val="Hyperlink"/>
+                <w:noProof/>
+              </w:rPr>
+              <w:t>Direitos dos associados</w:t>
+            </w:r>
+            <w:r>
+              <w:rPr>
+                <w:noProof/>
+                <w:webHidden/>
+              </w:rPr>
+              <w:tab/>
+            </w:r>
+            <w:r>
+              <w:rPr>
+                <w:noProof/>
+                <w:webHidden/>
+              </w:rPr>
+              <w:fldChar w:fldCharType="begin"/>
+            </w:r>
+            <w:r>
+              <w:rPr>
+                <w:noProof/>
+                <w:webHidden/>
+              </w:rPr>
+              <w:instrText xml:space="preserve"> PAGEREF _Toc236000098 \h </w:instrText>
+            </w:r>
+            <w:r>
+              <w:rPr>
+                <w:noProof/>
+                <w:webHidden/>
+              </w:rPr>
+            </w:r>
+            <w:r>
+              <w:rPr>
+                <w:noProof/>
+                <w:webHidden/>
+              </w:rPr>
+              <w:fldChar w:fldCharType="separate"/>
+            </w:r>
+            <w:r>
+              <w:rPr>
+                <w:noProof/>
+                <w:webHidden/>
+              </w:rPr>
+              <w:t>7</w:t>
+            </w:r>
+            <w:r>
+              <w:rPr>
+                <w:noProof/>
+                <w:webHidden/>
+              </w:rPr>
+              <w:fldChar w:fldCharType="end"/>
+            </w:r>
+          </w:hyperlink>
+        </w:p>
+        <w:p>
+          <w:pPr>
+            <w:pStyle w:val="TOC2"/>
+            <w:tabs>
+              <w:tab w:val="left" w:pos="720"/>
+              <w:tab w:val="right" w:leader="dot" w:pos="10456"/>
+            </w:tabs>
+            <w:rPr>
+              <w:rFonts w:eastAsiaTheme="minorEastAsia"/>
+              <w:noProof/>
+              <w:lang w:eastAsia="en-GB"/>
+            </w:rPr>
+          </w:pPr>
+          <w:hyperlink w:anchor="_Toc236000099" w:history="1">
+            <w:r>
+              <w:rPr>
+                <w:rStyle w:val="Hyperlink"/>
+                <w:rFonts w:ascii="Times New Roman" w:hAnsi="Times New Roman"/>
+                <w:noProof/>
+                <w:lang w:val="pt-PT"/>
+              </w:rPr>
+              <w:t>1)</w:t>
+            </w:r>
+            <w:r>
+              <w:rPr>
+                <w:rFonts w:eastAsiaTheme="minorEastAsia"/>
+                <w:noProof/>
+                <w:lang w:eastAsia="en-GB"/>
+              </w:rPr>
+              <w:tab/>
+            </w:r>
+            <w:r>
+              <w:rPr>
+                <w:rStyle w:val="Hyperlink"/>
+                <w:noProof/>
+                <w:lang w:val="pt-PT"/>
+              </w:rPr>
+              <w:t>São direitos dos associados no pleno gozo dos seus direitos:</w:t>
+            </w:r>
+            <w:r>
+              <w:rPr>
+                <w:noProof/>
+                <w:webHidden/>
+              </w:rPr>
+              <w:tab/>
+            </w:r>
+            <w:r>
+              <w:rPr>
+                <w:noProof/>
+                <w:webHidden/>
+              </w:rPr>
+              <w:fldChar w:fldCharType="begin"/>
+            </w:r>
+            <w:r>
+              <w:rPr>
+                <w:noProof/>
+                <w:webHidden/>
+              </w:rPr>
+              <w:instrText xml:space="preserve"> PAGEREF _Toc236000099 \h </w:instrText>
+            </w:r>
+            <w:r>
+              <w:rPr>
+                <w:noProof/>
+                <w:webHidden/>
+              </w:rPr>
+            </w:r>
+            <w:r>
+              <w:rPr>
+                <w:noProof/>
+                <w:webHidden/>
+              </w:rPr>
+              <w:fldChar w:fldCharType="separate"/>
+            </w:r>
+            <w:r>
+              <w:rPr>
+                <w:noProof/>
+                <w:webHidden/>
+              </w:rPr>
+              <w:t>7</w:t>
+            </w:r>
+            <w:r>
+              <w:rPr>
+                <w:noProof/>
+                <w:webHidden/>
+              </w:rPr>
+              <w:fldChar w:fldCharType="end"/>
+            </w:r>
+          </w:hyperlink>
+        </w:p>
+        <w:p>
+          <w:pPr>
+            <w:pStyle w:val="TOC2"/>
+            <w:tabs>
+              <w:tab w:val="left" w:pos="1440"/>
+              <w:tab w:val="right" w:leader="dot" w:pos="10456"/>
+            </w:tabs>
+            <w:rPr>
+              <w:rFonts w:eastAsiaTheme="minorEastAsia"/>
+              <w:noProof/>
+              <w:lang w:eastAsia="en-GB"/>
+            </w:rPr>
+          </w:pPr>
+          <w:hyperlink w:anchor="_Toc236000100" w:history="1">
+            <w:r>
+              <w:rPr>
+                <w:rStyle w:val="Hyperlink"/>
+                <w:noProof/>
+                <w:lang w:val="pt-PT"/>
+              </w:rPr>
+              <w:t>Artigo 9º</w:t>
+            </w:r>
+            <w:r>
+              <w:rPr>
+                <w:rFonts w:eastAsiaTheme="minorEastAsia"/>
+                <w:noProof/>
+                <w:lang w:eastAsia="en-GB"/>
+              </w:rPr>
+              <w:tab/>
+            </w:r>
+            <w:r>
+              <w:rPr>
+                <w:rStyle w:val="Hyperlink"/>
+                <w:noProof/>
+                <w:lang w:val="pt-PT"/>
+              </w:rPr>
+              <w:t>Deveres dos associados</w:t>
+            </w:r>
+            <w:r>
+              <w:rPr>
+                <w:noProof/>
+                <w:webHidden/>
+              </w:rPr>
+              <w:tab/>
+            </w:r>
+            <w:r>
+              <w:rPr>
+                <w:noProof/>
+                <w:webHidden/>
+              </w:rPr>
+              <w:fldChar w:fldCharType="begin"/>
+            </w:r>
+            <w:r>
+              <w:rPr>
+                <w:noProof/>
+                <w:webHidden/>
+              </w:rPr>
+              <w:instrText xml:space="preserve"> PAGEREF _Toc236000100 \h </w:instrText>
+            </w:r>
+            <w:r>
+              <w:rPr>
+                <w:noProof/>
+                <w:webHidden/>
+              </w:rPr>
+            </w:r>
+            <w:r>
+              <w:rPr>
+                <w:noProof/>
+                <w:webHidden/>
+              </w:rPr>
+              <w:fldChar w:fldCharType="separate"/>
+            </w:r>
+            <w:r>
+              <w:rPr>
+                <w:noProof/>
+                <w:webHidden/>
+              </w:rPr>
+              <w:t>7</w:t>
+            </w:r>
+            <w:r>
+              <w:rPr>
+                <w:noProof/>
+                <w:webHidden/>
+              </w:rPr>
+              <w:fldChar w:fldCharType="end"/>
+            </w:r>
+          </w:hyperlink>
+        </w:p>
+        <w:p>
+          <w:pPr>
+            <w:pStyle w:val="TOC2"/>
+            <w:tabs>
+              <w:tab w:val="left" w:pos="1680"/>
+              <w:tab w:val="right" w:leader="dot" w:pos="10456"/>
+            </w:tabs>
+            <w:rPr>
+              <w:rFonts w:eastAsiaTheme="minorEastAsia"/>
+              <w:noProof/>
+              <w:lang w:eastAsia="en-GB"/>
+            </w:rPr>
+          </w:pPr>
+          <w:hyperlink w:anchor="_Toc236000101" w:history="1">
+            <w:r>
+              <w:rPr>
+                <w:rStyle w:val="Hyperlink"/>
+                <w:noProof/>
+                <w:lang w:val="pt-PT"/>
+              </w:rPr>
+              <w:t>Artigo 10º</w:t>
+            </w:r>
+            <w:r>
+              <w:rPr>
+                <w:rFonts w:eastAsiaTheme="minorEastAsia"/>
+                <w:noProof/>
+                <w:lang w:eastAsia="en-GB"/>
+              </w:rPr>
+              <w:tab/>
+            </w:r>
+            <w:r>
+              <w:rPr>
+                <w:rStyle w:val="Hyperlink"/>
+                <w:noProof/>
+                <w:lang w:val="pt-PT"/>
+              </w:rPr>
+              <w:t>Perda da qualidade de associado e sanções</w:t>
+            </w:r>
+            <w:r>
+              <w:rPr>
+                <w:noProof/>
+                <w:webHidden/>
+              </w:rPr>
+              <w:tab/>
+            </w:r>
+            <w:r>
+              <w:rPr>
+                <w:noProof/>
+                <w:webHidden/>
+              </w:rPr>
+              <w:fldChar w:fldCharType="begin"/>
+            </w:r>
+            <w:r>
+              <w:rPr>
+                <w:noProof/>
+                <w:webHidden/>
+              </w:rPr>
+              <w:instrText xml:space="preserve"> PAGEREF _Toc236000101 \h </w:instrText>
+            </w:r>
+            <w:r>
+              <w:rPr>
+                <w:noProof/>
+                <w:webHidden/>
+              </w:rPr>
+            </w:r>
+            <w:r>
+              <w:rPr>
+                <w:noProof/>
+                <w:webHidden/>
+              </w:rPr>
+              <w:fldChar w:fldCharType="separate"/>
+            </w:r>
+            <w:r>
+              <w:rPr>
+                <w:noProof/>
+                <w:webHidden/>
+              </w:rPr>
+              <w:t>8</w:t>
+            </w:r>
+            <w:r>
+              <w:rPr>
+                <w:noProof/>
+                <w:webHidden/>
+              </w:rPr>
+              <w:fldChar w:fldCharType="end"/>
+            </w:r>
+          </w:hyperlink>
+        </w:p>
+        <w:p>
+          <w:pPr>
+            <w:pStyle w:val="TOC1"/>
+            <w:tabs>
+              <w:tab w:val="left" w:pos="1440"/>
+              <w:tab w:val="right" w:leader="dot" w:pos="10456"/>
+            </w:tabs>
+            <w:rPr>
+              <w:rFonts w:eastAsiaTheme="minorEastAsia"/>
+              <w:noProof/>
+              <w:lang w:eastAsia="en-GB"/>
+            </w:rPr>
+          </w:pPr>
+          <w:hyperlink w:anchor="_Toc236000102" w:history="1">
+            <w:r>
+              <w:rPr>
+                <w:rStyle w:val="Hyperlink"/>
+                <w:noProof/>
+                <w:lang w:val="pt-PT"/>
+              </w:rPr>
+              <w:t>Capítulo 3º</w:t>
+            </w:r>
+            <w:r>
+              <w:rPr>
+                <w:rFonts w:eastAsiaTheme="minorEastAsia"/>
+                <w:noProof/>
+                <w:lang w:eastAsia="en-GB"/>
+              </w:rPr>
+              <w:tab/>
+            </w:r>
+            <w:r>
+              <w:rPr>
+                <w:rStyle w:val="Hyperlink"/>
+                <w:noProof/>
+                <w:lang w:val="pt-PT"/>
+              </w:rPr>
+              <w:t>Órgãos Sociais</w:t>
+            </w:r>
+            <w:r>
+              <w:rPr>
+                <w:noProof/>
+                <w:webHidden/>
+              </w:rPr>
+              <w:tab/>
+            </w:r>
+            <w:r>
+              <w:rPr>
+                <w:noProof/>
+                <w:webHidden/>
+              </w:rPr>
+              <w:fldChar w:fldCharType="begin"/>
+            </w:r>
+            <w:r>
+              <w:rPr>
+                <w:noProof/>
+                <w:webHidden/>
+              </w:rPr>
+              <w:instrText xml:space="preserve"> PAGEREF _Toc236000102 \h </w:instrText>
+            </w:r>
+            <w:r>
+              <w:rPr>
+                <w:noProof/>
+                <w:webHidden/>
+              </w:rPr>
+            </w:r>
+            <w:r>
+              <w:rPr>
+                <w:noProof/>
+                <w:webHidden/>
+              </w:rPr>
+              <w:fldChar w:fldCharType="separate"/>
+            </w:r>
+            <w:r>
+              <w:rPr>
+                <w:noProof/>
+                <w:webHidden/>
+              </w:rPr>
+              <w:t>8</w:t>
+            </w:r>
+            <w:r>
+              <w:rPr>
+                <w:noProof/>
+                <w:webHidden/>
+              </w:rPr>
+              <w:fldChar w:fldCharType="end"/>
+            </w:r>
+          </w:hyperlink>
+        </w:p>
+        <w:p>
+          <w:pPr>
+            <w:pStyle w:val="TOC2"/>
+            <w:tabs>
+              <w:tab w:val="left" w:pos="1680"/>
+              <w:tab w:val="right" w:leader="dot" w:pos="10456"/>
+            </w:tabs>
+            <w:rPr>
+              <w:rFonts w:eastAsiaTheme="minorEastAsia"/>
+              <w:noProof/>
+              <w:lang w:eastAsia="en-GB"/>
+            </w:rPr>
+          </w:pPr>
+          <w:hyperlink w:anchor="_Toc236000103" w:history="1">
+            <w:r>
+              <w:rPr>
+                <w:rStyle w:val="Hyperlink"/>
+                <w:noProof/>
+                <w:lang w:val="pt-PT"/>
+              </w:rPr>
+              <w:t>Artigo 11º</w:t>
+            </w:r>
+            <w:r>
+              <w:rPr>
+                <w:rFonts w:eastAsiaTheme="minorEastAsia"/>
+                <w:noProof/>
+                <w:lang w:eastAsia="en-GB"/>
+              </w:rPr>
+              <w:tab/>
+            </w:r>
+            <w:r>
+              <w:rPr>
+                <w:rStyle w:val="Hyperlink"/>
+                <w:noProof/>
+                <w:lang w:val="pt-PT"/>
+              </w:rPr>
+              <w:t>Órgãos</w:t>
+            </w:r>
+            <w:r>
+              <w:rPr>
+                <w:noProof/>
+                <w:webHidden/>
+              </w:rPr>
+              <w:tab/>
+            </w:r>
+            <w:r>
+              <w:rPr>
+                <w:noProof/>
+                <w:webHidden/>
+              </w:rPr>
+              <w:fldChar w:fldCharType="begin"/>
+            </w:r>
+            <w:r>
+              <w:rPr>
+                <w:noProof/>
+                <w:webHidden/>
+              </w:rPr>
+              <w:instrText xml:space="preserve"> PAGEREF _Toc236000103 \h </w:instrText>
+            </w:r>
+            <w:r>
+              <w:rPr>
+                <w:noProof/>
+                <w:webHidden/>
+              </w:rPr>
+            </w:r>
+            <w:r>
+              <w:rPr>
+                <w:noProof/>
+                <w:webHidden/>
+              </w:rPr>
+              <w:fldChar w:fldCharType="separate"/>
+            </w:r>
+            <w:r>
+              <w:rPr>
+                <w:noProof/>
+                <w:webHidden/>
+              </w:rPr>
+              <w:t>8</w:t>
+            </w:r>
+            <w:r>
+              <w:rPr>
+                <w:noProof/>
+                <w:webHidden/>
+              </w:rPr>
+              <w:fldChar w:fldCharType="end"/>
+            </w:r>
+          </w:hyperlink>
+        </w:p>
+        <w:p>
+          <w:pPr>
+            <w:pStyle w:val="TOC2"/>
+            <w:tabs>
+              <w:tab w:val="left" w:pos="1680"/>
+              <w:tab w:val="right" w:leader="dot" w:pos="10456"/>
+            </w:tabs>
+            <w:rPr>
+              <w:rFonts w:eastAsiaTheme="minorEastAsia"/>
+              <w:noProof/>
+              <w:lang w:eastAsia="en-GB"/>
+            </w:rPr>
+          </w:pPr>
+          <w:hyperlink w:anchor="_Toc236000104" w:history="1">
+            <w:r>
+              <w:rPr>
+                <w:rStyle w:val="Hyperlink"/>
+                <w:noProof/>
+                <w:lang w:val="pt-PT"/>
+              </w:rPr>
+              <w:t>Artigo 12º</w:t>
+            </w:r>
+            <w:r>
+              <w:rPr>
+                <w:rFonts w:eastAsiaTheme="minorEastAsia"/>
+                <w:noProof/>
+                <w:lang w:eastAsia="en-GB"/>
+              </w:rPr>
+              <w:tab/>
+            </w:r>
+            <w:r>
+              <w:rPr>
+                <w:rStyle w:val="Hyperlink"/>
+                <w:noProof/>
+                <w:lang w:val="pt-PT"/>
+              </w:rPr>
+              <w:t>Mandato e gratuitidade</w:t>
+            </w:r>
+            <w:r>
+              <w:rPr>
+                <w:noProof/>
+                <w:webHidden/>
+              </w:rPr>
+              <w:tab/>
+            </w:r>
+            <w:r>
+              <w:rPr>
+                <w:noProof/>
+                <w:webHidden/>
+              </w:rPr>
+              <w:fldChar w:fldCharType="begin"/>
+            </w:r>
+            <w:r>
+              <w:rPr>
+                <w:noProof/>
+                <w:webHidden/>
+              </w:rPr>
+              <w:instrText xml:space="preserve"> PAGEREF _Toc236000104 \h </w:instrText>
+            </w:r>
+            <w:r>
+              <w:rPr>
+                <w:noProof/>
+                <w:webHidden/>
+              </w:rPr>
+            </w:r>
+            <w:r>
+              <w:rPr>
+                <w:noProof/>
+                <w:webHidden/>
+              </w:rPr>
+              <w:fldChar w:fldCharType="separate"/>
+            </w:r>
+            <w:r>
+              <w:rPr>
+                <w:noProof/>
+                <w:webHidden/>
+              </w:rPr>
+              <w:t>8</w:t>
+            </w:r>
+            <w:r>
+              <w:rPr>
+                <w:noProof/>
+                <w:webHidden/>
+              </w:rPr>
+              <w:fldChar w:fldCharType="end"/>
+            </w:r>
+          </w:hyperlink>
+        </w:p>
+        <w:p>
+          <w:pPr>
+            <w:pStyle w:val="TOC2"/>
+            <w:tabs>
+              <w:tab w:val="left" w:pos="1680"/>
+              <w:tab w:val="right" w:leader="dot" w:pos="10456"/>
+            </w:tabs>
+            <w:rPr>
+              <w:rFonts w:eastAsiaTheme="minorEastAsia"/>
+              <w:noProof/>
+              <w:lang w:eastAsia="en-GB"/>
+            </w:rPr>
+          </w:pPr>
+          <w:hyperlink w:anchor="_Toc236000105" w:history="1">
+            <w:r>
+              <w:rPr>
+                <w:rStyle w:val="Hyperlink"/>
+                <w:noProof/>
+                <w:lang w:val="pt-PT"/>
+              </w:rPr>
+              <w:t>Artigo 13º</w:t>
+            </w:r>
+            <w:r>
+              <w:rPr>
+                <w:rFonts w:eastAsiaTheme="minorEastAsia"/>
+                <w:noProof/>
+                <w:lang w:eastAsia="en-GB"/>
+              </w:rPr>
+              <w:tab/>
+            </w:r>
+            <w:r>
+              <w:rPr>
+                <w:rStyle w:val="Hyperlink"/>
+                <w:noProof/>
+                <w:lang w:val="pt-PT"/>
+              </w:rPr>
+              <w:t>Assembleia Geral</w:t>
+            </w:r>
+            <w:r>
+              <w:rPr>
+                <w:noProof/>
+                <w:webHidden/>
+              </w:rPr>
+              <w:tab/>
+            </w:r>
+            <w:r>
+              <w:rPr>
+                <w:noProof/>
+                <w:webHidden/>
+              </w:rPr>
+              <w:fldChar w:fldCharType="begin"/>
+            </w:r>
+            <w:r>
+              <w:rPr>
+                <w:noProof/>
+                <w:webHidden/>
+              </w:rPr>
+              <w:instrText xml:space="preserve"> PAGEREF _Toc236000105 \h </w:instrText>
+            </w:r>
+            <w:r>
+              <w:rPr>
+                <w:noProof/>
+                <w:webHidden/>
+              </w:rPr>
+            </w:r>
+            <w:r>
+              <w:rPr>
+                <w:noProof/>
+                <w:webHidden/>
+              </w:rPr>
+              <w:fldChar w:fldCharType="separate"/>
+            </w:r>
+            <w:r>
+              <w:rPr>
+                <w:noProof/>
+                <w:webHidden/>
+              </w:rPr>
+              <w:t>8</w:t>
+            </w:r>
+            <w:r>
+              <w:rPr>
+                <w:noProof/>
+                <w:webHidden/>
+              </w:rPr>
+              <w:fldChar w:fldCharType="end"/>
+            </w:r>
+          </w:hyperlink>
+        </w:p>
+        <w:p>
+          <w:pPr>
+            <w:pStyle w:val="TOC2"/>
+            <w:tabs>
+              <w:tab w:val="left" w:pos="1680"/>
+              <w:tab w:val="right" w:leader="dot" w:pos="10456"/>
+            </w:tabs>
+            <w:rPr>
+              <w:rFonts w:eastAsiaTheme="minorEastAsia"/>
+              <w:noProof/>
+              <w:lang w:eastAsia="en-GB"/>
+            </w:rPr>
+          </w:pPr>
+          <w:hyperlink w:anchor="_Toc236000106" w:history="1">
+            <w:r>
+              <w:rPr>
+                <w:rStyle w:val="Hyperlink"/>
+                <w:noProof/>
+                <w:lang w:val="pt-PT"/>
+              </w:rPr>
+              <w:t>Artigo 14º</w:t>
+            </w:r>
+            <w:r>
+              <w:rPr>
+                <w:rFonts w:eastAsiaTheme="minorEastAsia"/>
+                <w:noProof/>
+                <w:lang w:eastAsia="en-GB"/>
+              </w:rPr>
+              <w:tab/>
+            </w:r>
+            <w:r>
+              <w:rPr>
+                <w:rStyle w:val="Hyperlink"/>
+                <w:noProof/>
+                <w:lang w:val="pt-PT"/>
+              </w:rPr>
+              <w:t>Mesa da Assembleia Geral</w:t>
+            </w:r>
+            <w:r>
+              <w:rPr>
+                <w:noProof/>
+                <w:webHidden/>
+              </w:rPr>
+              <w:tab/>
+            </w:r>
+            <w:r>
+              <w:rPr>
+                <w:noProof/>
+                <w:webHidden/>
+              </w:rPr>
+              <w:fldChar w:fldCharType="begin"/>
+            </w:r>
+            <w:r>
+              <w:rPr>
+                <w:noProof/>
+                <w:webHidden/>
+              </w:rPr>
+              <w:instrText xml:space="preserve"> PAGEREF _Toc236000106 \h </w:instrText>
+            </w:r>
+            <w:r>
+              <w:rPr>
+                <w:noProof/>
+                <w:webHidden/>
+              </w:rPr>
+            </w:r>
+            <w:r>
+              <w:rPr>
+                <w:noProof/>
+                <w:webHidden/>
+              </w:rPr>
+              <w:fldChar w:fldCharType="separate"/>
+            </w:r>
+            <w:r>
+              <w:rPr>
+                <w:noProof/>
+                <w:webHidden/>
+              </w:rPr>
+              <w:t>9</w:t>
+            </w:r>
+            <w:r>
+              <w:rPr>
+                <w:noProof/>
+                <w:webHidden/>
+              </w:rPr>
+              <w:fldChar w:fldCharType="end"/>
+            </w:r>
+          </w:hyperlink>
+        </w:p>
+        <w:p>
+          <w:pPr>
+            <w:pStyle w:val="TOC2"/>
+            <w:tabs>
+              <w:tab w:val="left" w:pos="1680"/>
+              <w:tab w:val="right" w:leader="dot" w:pos="10456"/>
+            </w:tabs>
+            <w:rPr>
+              <w:rFonts w:eastAsiaTheme="minorEastAsia"/>
+              <w:noProof/>
+              <w:lang w:eastAsia="en-GB"/>
+            </w:rPr>
+          </w:pPr>
+          <w:hyperlink w:anchor="_Toc236000107" w:history="1">
+            <w:r>
+              <w:rPr>
+                <w:rStyle w:val="Hyperlink"/>
+                <w:noProof/>
+              </w:rPr>
+              <w:t>Artigo 15º</w:t>
+            </w:r>
+            <w:r>
+              <w:rPr>
+                <w:rFonts w:eastAsiaTheme="minorEastAsia"/>
+                <w:noProof/>
+                <w:lang w:eastAsia="en-GB"/>
+              </w:rPr>
+              <w:tab/>
+            </w:r>
+            <w:r>
+              <w:rPr>
+                <w:rStyle w:val="Hyperlink"/>
+                <w:noProof/>
+              </w:rPr>
+              <w:t>Conselho Fiscal</w:t>
+            </w:r>
+            <w:r>
+              <w:rPr>
+                <w:noProof/>
+                <w:webHidden/>
+              </w:rPr>
+              <w:tab/>
+            </w:r>
+            <w:r>
+              <w:rPr>
+                <w:noProof/>
+                <w:webHidden/>
+              </w:rPr>
+              <w:fldChar w:fldCharType="begin"/>
+            </w:r>
+            <w:r>
+              <w:rPr>
+                <w:noProof/>
+                <w:webHidden/>
+              </w:rPr>
+              <w:instrText xml:space="preserve"> PAGEREF _Toc236000107 \h </w:instrText>
+            </w:r>
+            <w:r>
+              <w:rPr>
+                <w:noProof/>
+                <w:webHidden/>
+              </w:rPr>
+            </w:r>
+            <w:r>
+              <w:rPr>
+                <w:noProof/>
+                <w:webHidden/>
+              </w:rPr>
+              <w:fldChar w:fldCharType="separate"/>
+            </w:r>
+            <w:r>
+              <w:rPr>
+                <w:noProof/>
+                <w:webHidden/>
+              </w:rPr>
+              <w:t>9</w:t>
+            </w:r>
+            <w:r>
+              <w:rPr>
+                <w:noProof/>
+                <w:webHidden/>
+              </w:rPr>
+              <w:fldChar w:fldCharType="end"/>
+            </w:r>
+          </w:hyperlink>
+        </w:p>
+        <w:p>
+          <w:pPr>
+            <w:pStyle w:val="TOC1"/>
+            <w:tabs>
+              <w:tab w:val="left" w:pos="1440"/>
+              <w:tab w:val="right" w:leader="dot" w:pos="10456"/>
+            </w:tabs>
+            <w:rPr>
+              <w:rFonts w:eastAsiaTheme="minorEastAsia"/>
+              <w:noProof/>
+              <w:lang w:eastAsia="en-GB"/>
+            </w:rPr>
+          </w:pPr>
+          <w:hyperlink w:anchor="_Toc236000108" w:history="1">
+            <w:r>
+              <w:rPr>
+                <w:rStyle w:val="Hyperlink"/>
+                <w:noProof/>
+                <w:lang w:val="pt-PT"/>
+              </w:rPr>
+              <w:t>Capítulo 4º</w:t>
+            </w:r>
+            <w:r>
+              <w:rPr>
+                <w:rFonts w:eastAsiaTheme="minorEastAsia"/>
+                <w:noProof/>
+                <w:lang w:eastAsia="en-GB"/>
+              </w:rPr>
+              <w:tab/>
+            </w:r>
+            <w:r>
+              <w:rPr>
+                <w:rStyle w:val="Hyperlink"/>
+                <w:noProof/>
+                <w:lang w:val="pt-PT"/>
+              </w:rPr>
+              <w:t>Regime Financeiro e Patrimonial</w:t>
+            </w:r>
+            <w:r>
+              <w:rPr>
+                <w:noProof/>
+                <w:webHidden/>
+              </w:rPr>
+              <w:tab/>
+            </w:r>
+            <w:r>
+              <w:rPr>
+                <w:noProof/>
+                <w:webHidden/>
+              </w:rPr>
+              <w:fldChar w:fldCharType="begin"/>
+            </w:r>
+            <w:r>
+              <w:rPr>
+                <w:noProof/>
+                <w:webHidden/>
+              </w:rPr>
+              <w:instrText xml:space="preserve"> PAGEREF _Toc236000108 \h </w:instrText>
+            </w:r>
+            <w:r>
+              <w:rPr>
+                <w:noProof/>
+                <w:webHidden/>
+              </w:rPr>
+            </w:r>
+            <w:r>
+              <w:rPr>
+                <w:noProof/>
+                <w:webHidden/>
+              </w:rPr>
+              <w:fldChar w:fldCharType="separate"/>
+            </w:r>
+            <w:r>
+              <w:rPr>
+                <w:noProof/>
+                <w:webHidden/>
+              </w:rPr>
+              <w:t>10</w:t>
+            </w:r>
+            <w:r>
+              <w:rPr>
+                <w:noProof/>
+                <w:webHidden/>
+              </w:rPr>
+              <w:fldChar w:fldCharType="end"/>
+            </w:r>
+          </w:hyperlink>
+        </w:p>
+        <w:p>
+          <w:pPr>
+            <w:pStyle w:val="TOC2"/>
+            <w:tabs>
+              <w:tab w:val="left" w:pos="1680"/>
+              <w:tab w:val="right" w:leader="dot" w:pos="10456"/>
+            </w:tabs>
+            <w:rPr>
+              <w:rFonts w:eastAsiaTheme="minorEastAsia"/>
+              <w:noProof/>
+              <w:lang w:eastAsia="en-GB"/>
+            </w:rPr>
+          </w:pPr>
+          <w:hyperlink w:anchor="_Toc236000109" w:history="1">
+            <w:r>
+              <w:rPr>
+                <w:rStyle w:val="Hyperlink"/>
+                <w:noProof/>
+                <w:lang w:val="pt-PT"/>
+              </w:rPr>
+              <w:t>Artigo 16º</w:t>
+            </w:r>
+            <w:r>
+              <w:rPr>
+                <w:rFonts w:eastAsiaTheme="minorEastAsia"/>
+                <w:noProof/>
+                <w:lang w:eastAsia="en-GB"/>
+              </w:rPr>
+              <w:tab/>
+            </w:r>
+            <w:r>
+              <w:rPr>
+                <w:rStyle w:val="Hyperlink"/>
+                <w:noProof/>
+                <w:lang w:val="pt-PT"/>
+              </w:rPr>
+              <w:t>Receitas</w:t>
+            </w:r>
+            <w:r>
+              <w:rPr>
+                <w:noProof/>
+                <w:webHidden/>
+              </w:rPr>
+              <w:tab/>
+            </w:r>
+            <w:r>
+              <w:rPr>
+                <w:noProof/>
+                <w:webHidden/>
+              </w:rPr>
+              <w:fldChar w:fldCharType="begin"/>
+            </w:r>
+            <w:r>
+              <w:rPr>
+                <w:noProof/>
+                <w:webHidden/>
+              </w:rPr>
+              <w:instrText xml:space="preserve"> PAGEREF _Toc236000109 \h </w:instrText>
+            </w:r>
+            <w:r>
+              <w:rPr>
+                <w:noProof/>
+                <w:webHidden/>
+              </w:rPr>
+            </w:r>
+            <w:r>
+              <w:rPr>
+                <w:noProof/>
+                <w:webHidden/>
+              </w:rPr>
+              <w:fldChar w:fldCharType="separate"/>
+            </w:r>
+            <w:r>
+              <w:rPr>
+                <w:noProof/>
+                <w:webHidden/>
+              </w:rPr>
+              <w:t>10</w:t>
+            </w:r>
+            <w:r>
+              <w:rPr>
+                <w:noProof/>
+                <w:webHidden/>
+              </w:rPr>
+              <w:fldChar w:fldCharType="end"/>
+            </w:r>
+          </w:hyperlink>
+        </w:p>
+        <w:p>
+          <w:pPr>
+            <w:pStyle w:val="TOC2"/>
+            <w:tabs>
+              <w:tab w:val="left" w:pos="1680"/>
+              <w:tab w:val="right" w:leader="dot" w:pos="10456"/>
+            </w:tabs>
+            <w:rPr>
+              <w:rFonts w:eastAsiaTheme="minorEastAsia"/>
+              <w:noProof/>
+              <w:lang w:eastAsia="en-GB"/>
+            </w:rPr>
+          </w:pPr>
+          <w:hyperlink w:anchor="_Toc236000110" w:history="1">
+            <w:r>
+              <w:rPr>
+                <w:rStyle w:val="Hyperlink"/>
+                <w:noProof/>
+                <w:lang w:val="pt-PT"/>
+              </w:rPr>
+              <w:t>Artigo 17º</w:t>
+            </w:r>
+            <w:r>
+              <w:rPr>
+                <w:rFonts w:eastAsiaTheme="minorEastAsia"/>
+                <w:noProof/>
+                <w:lang w:eastAsia="en-GB"/>
+              </w:rPr>
+              <w:tab/>
+            </w:r>
+            <w:r>
+              <w:rPr>
+                <w:rStyle w:val="Hyperlink"/>
+                <w:noProof/>
+                <w:lang w:val="pt-PT"/>
+              </w:rPr>
+              <w:t>Património e exercício</w:t>
+            </w:r>
+            <w:r>
+              <w:rPr>
+                <w:noProof/>
+                <w:webHidden/>
+              </w:rPr>
+              <w:tab/>
+            </w:r>
+            <w:r>
+              <w:rPr>
+                <w:noProof/>
+                <w:webHidden/>
+              </w:rPr>
+              <w:fldChar w:fldCharType="begin"/>
+            </w:r>
+            <w:r>
+              <w:rPr>
+                <w:noProof/>
+                <w:webHidden/>
+              </w:rPr>
+              <w:instrText xml:space="preserve"> PAGEREF _Toc236000110 \h </w:instrText>
+            </w:r>
+            <w:r>
+              <w:rPr>
+                <w:noProof/>
+                <w:webHidden/>
+              </w:rPr>
+            </w:r>
+            <w:r>
+              <w:rPr>
+                <w:noProof/>
+                <w:webHidden/>
+              </w:rPr>
+              <w:fldChar w:fldCharType="separate"/>
+            </w:r>
+            <w:r>
+              <w:rPr>
+                <w:noProof/>
+                <w:webHidden/>
+              </w:rPr>
+              <w:t>10</w:t>
+            </w:r>
+            <w:r>
+              <w:rPr>
+                <w:noProof/>
+                <w:webHidden/>
+              </w:rPr>
+              <w:fldChar w:fldCharType="end"/>
+            </w:r>
+          </w:hyperlink>
+        </w:p>
+        <w:p>
+          <w:pPr>
+            <w:pStyle w:val="TOC2"/>
+            <w:tabs>
+              <w:tab w:val="left" w:pos="1680"/>
+              <w:tab w:val="right" w:leader="dot" w:pos="10456"/>
+            </w:tabs>
+            <w:rPr>
+              <w:rFonts w:eastAsiaTheme="minorEastAsia"/>
+              <w:noProof/>
+              <w:lang w:eastAsia="en-GB"/>
+            </w:rPr>
+          </w:pPr>
+          <w:hyperlink w:anchor="_Toc236000111" w:history="1">
+            <w:r>
+              <w:rPr>
+                <w:rStyle w:val="Hyperlink"/>
+                <w:noProof/>
+                <w:lang w:val="pt-PT"/>
+              </w:rPr>
+              <w:t>Artigo 18º</w:t>
+            </w:r>
+            <w:r>
+              <w:rPr>
+                <w:rFonts w:eastAsiaTheme="minorEastAsia"/>
+                <w:noProof/>
+                <w:lang w:eastAsia="en-GB"/>
+              </w:rPr>
+              <w:tab/>
+            </w:r>
+            <w:r>
+              <w:rPr>
+                <w:rStyle w:val="Hyperlink"/>
+                <w:noProof/>
+                <w:lang w:val="pt-PT"/>
+              </w:rPr>
+              <w:t>Dissolução e destino do património</w:t>
+            </w:r>
+            <w:r>
+              <w:rPr>
+                <w:noProof/>
+                <w:webHidden/>
+              </w:rPr>
+              <w:tab/>
+            </w:r>
+            <w:r>
+              <w:rPr>
+                <w:noProof/>
+                <w:webHidden/>
+              </w:rPr>
+              <w:fldChar w:fldCharType="begin"/>
+            </w:r>
+            <w:r>
+              <w:rPr>
+                <w:noProof/>
+                <w:webHidden/>
+              </w:rPr>
+              <w:instrText xml:space="preserve"> PAGEREF _Toc236000111 \h </w:instrText>
+            </w:r>
+            <w:r>
+              <w:rPr>
+                <w:noProof/>
+                <w:webHidden/>
+              </w:rPr>
+            </w:r>
+            <w:r>
+              <w:rPr>
+                <w:noProof/>
+                <w:webHidden/>
+              </w:rPr>
+              <w:fldChar w:fldCharType="separate"/>
+            </w:r>
+            <w:r>
+              <w:rPr>
+                <w:noProof/>
+                <w:webHidden/>
+              </w:rPr>
+              <w:t>10</w:t>
+            </w:r>
+            <w:r>
+              <w:rPr>
+                <w:noProof/>
+                <w:webHidden/>
+              </w:rPr>
+              <w:fldChar w:fldCharType="end"/>
+            </w:r>
+          </w:hyperlink>
+        </w:p>
+        <w:p>
+          <w:pPr>
+            <w:pStyle w:val="TOC1"/>
+            <w:tabs>
+              <w:tab w:val="left" w:pos="1440"/>
+              <w:tab w:val="right" w:leader="dot" w:pos="10456"/>
+            </w:tabs>
+            <w:rPr>
+              <w:rFonts w:eastAsiaTheme="minorEastAsia"/>
+              <w:noProof/>
+              <w:lang w:eastAsia="en-GB"/>
+            </w:rPr>
+          </w:pPr>
+          <w:hyperlink w:anchor="_Toc236000112" w:history="1">
+            <w:r>
+              <w:rPr>
+                <w:rStyle w:val="Hyperlink"/>
+                <w:noProof/>
+                <w:lang w:val="pt-PT"/>
+              </w:rPr>
+              <w:t>Capítulo 5º</w:t>
+            </w:r>
+            <w:r>
+              <w:rPr>
+                <w:rFonts w:eastAsiaTheme="minorEastAsia"/>
+                <w:noProof/>
+                <w:lang w:eastAsia="en-GB"/>
+              </w:rPr>
+              <w:tab/>
+            </w:r>
+            <w:r>
+              <w:rPr>
+                <w:rStyle w:val="Hyperlink"/>
+                <w:noProof/>
+                <w:lang w:val="pt-PT"/>
+              </w:rPr>
+              <w:t>Disposições Finais</w:t>
+            </w:r>
+            <w:r>
+              <w:rPr>
+                <w:noProof/>
+                <w:webHidden/>
+              </w:rPr>
+              <w:tab/>
+            </w:r>
+            <w:r>
+              <w:rPr>
+                <w:noProof/>
+                <w:webHidden/>
+              </w:rPr>
+              <w:fldChar w:fldCharType="begin"/>
+            </w:r>
+            <w:r>
+              <w:rPr>
+                <w:noProof/>
+                <w:webHidden/>
+              </w:rPr>
+              <w:instrText xml:space="preserve"> PAGEREF _Toc236000112 \h </w:instrText>
+            </w:r>
+            <w:r>
+              <w:rPr>
+                <w:noProof/>
+                <w:webHidden/>
+              </w:rPr>
+            </w:r>
+            <w:r>
+              <w:rPr>
+                <w:noProof/>
+                <w:webHidden/>
+              </w:rPr>
+              <w:fldChar w:fldCharType="separate"/>
+            </w:r>
+            <w:r>
+              <w:rPr>
+                <w:noProof/>
+                <w:webHidden/>
+              </w:rPr>
+              <w:t>10</w:t>
+            </w:r>
+            <w:r>
+              <w:rPr>
+                <w:noProof/>
+                <w:webHidden/>
+              </w:rPr>
+              <w:fldChar w:fldCharType="end"/>
+            </w:r>
+          </w:hyperlink>
+        </w:p>
+        <w:p>
+          <w:pPr>
+            <w:pStyle w:val="TOC2"/>
+            <w:tabs>
+              <w:tab w:val="left" w:pos="1680"/>
+              <w:tab w:val="right" w:leader="dot" w:pos="10456"/>
+            </w:tabs>
+            <w:rPr>
+              <w:rFonts w:eastAsiaTheme="minorEastAsia"/>
+              <w:noProof/>
+              <w:lang w:eastAsia="en-GB"/>
+            </w:rPr>
+          </w:pPr>
+          <w:hyperlink w:anchor="_Toc236000113" w:history="1">
+            <w:r>
+              <w:rPr>
+                <w:rStyle w:val="Hyperlink"/>
+                <w:noProof/>
+                <w:lang w:val="pt-PT"/>
+              </w:rPr>
+              <w:t>Artigo 19º</w:t>
+            </w:r>
+            <w:r>
+              <w:rPr>
+                <w:rFonts w:eastAsiaTheme="minorEastAsia"/>
+                <w:noProof/>
+                <w:lang w:eastAsia="en-GB"/>
+              </w:rPr>
+              <w:tab/>
+            </w:r>
+            <w:r>
+              <w:rPr>
+                <w:rStyle w:val="Hyperlink"/>
+                <w:noProof/>
+                <w:lang w:val="pt-PT"/>
+              </w:rPr>
+              <w:t>Regulamento interno</w:t>
+            </w:r>
+            <w:r>
+              <w:rPr>
+                <w:noProof/>
+                <w:webHidden/>
+              </w:rPr>
+              <w:tab/>
+            </w:r>
+            <w:r>
+              <w:rPr>
+                <w:noProof/>
+                <w:webHidden/>
+              </w:rPr>
+              <w:fldChar w:fldCharType="begin"/>
+            </w:r>
+            <w:r>
+              <w:rPr>
+                <w:noProof/>
+                <w:webHidden/>
+              </w:rPr>
+              <w:instrText xml:space="preserve"> PAGEREF _Toc236000113 \h </w:instrText>
+            </w:r>
+            <w:r>
+              <w:rPr>
+                <w:noProof/>
+                <w:webHidden/>
+              </w:rPr>
+            </w:r>
+            <w:r>
+              <w:rPr>
+                <w:noProof/>
+                <w:webHidden/>
+              </w:rPr>
+              <w:fldChar w:fldCharType="separate"/>
+            </w:r>
+            <w:r>
+              <w:rPr>
+                <w:noProof/>
+                <w:webHidden/>
+              </w:rPr>
+              <w:t>10</w:t>
+            </w:r>
+            <w:r>
+              <w:rPr>
+                <w:noProof/>
+                <w:webHidden/>
+              </w:rPr>
+              <w:fldChar w:fldCharType="end"/>
+            </w:r>
+          </w:hyperlink>
+        </w:p>
+        <w:p>
+          <w:pPr>
+            <w:pStyle w:val="TOC2"/>
+            <w:tabs>
+              <w:tab w:val="left" w:pos="1680"/>
+              <w:tab w:val="right" w:leader="dot" w:pos="10456"/>
+            </w:tabs>
+            <w:rPr>
+              <w:rFonts w:eastAsiaTheme="minorEastAsia"/>
+              <w:noProof/>
+              <w:lang w:eastAsia="en-GB"/>
+            </w:rPr>
+          </w:pPr>
+          <w:hyperlink w:anchor="_Toc236000114" w:history="1">
+            <w:r>
+              <w:rPr>
+                <w:rStyle w:val="Hyperlink"/>
+                <w:noProof/>
+                <w:lang w:val="pt-PT"/>
+              </w:rPr>
+              <w:t>Artigo 20º</w:t>
+            </w:r>
+            <w:r>
+              <w:rPr>
+                <w:rFonts w:eastAsiaTheme="minorEastAsia"/>
+                <w:noProof/>
+                <w:lang w:eastAsia="en-GB"/>
+              </w:rPr>
+              <w:tab/>
+            </w:r>
+            <w:r>
+              <w:rPr>
+                <w:rStyle w:val="Hyperlink"/>
+                <w:noProof/>
+                <w:lang w:val="pt-PT"/>
+              </w:rPr>
+              <w:t>Casos omissos</w:t>
+            </w:r>
+            <w:r>
+              <w:rPr>
+                <w:noProof/>
+                <w:webHidden/>
+              </w:rPr>
+              <w:tab/>
+            </w:r>
+            <w:r>
+              <w:rPr>
+                <w:noProof/>
+                <w:webHidden/>
+              </w:rPr>
+              <w:fldChar w:fldCharType="begin"/>
+            </w:r>
+            <w:r>
+              <w:rPr>
+                <w:noProof/>
+                <w:webHidden/>
+              </w:rPr>
+              <w:instrText xml:space="preserve"> PAGEREF _Toc236000114 \h </w:instrText>
+            </w:r>
+            <w:r>
+              <w:rPr>
+                <w:noProof/>
+                <w:webHidden/>
+              </w:rPr>
+            </w:r>
+            <w:r>
+              <w:rPr>
+                <w:noProof/>
+                <w:webHidden/>
+              </w:rPr>
+              <w:fldChar w:fldCharType="separate"/>
+            </w:r>
+            <w:r>
+              <w:rPr>
+                <w:noProof/>
+                <w:webHidden/>
+              </w:rPr>
+              <w:t>10</w:t>
+            </w:r>
+            <w:r>
+              <w:rPr>
+                <w:noProof/>
+                <w:webHidden/>
+              </w:rPr>
+              <w:fldChar w:fldCharType="end"/>
+            </w:r>
+          </w:hyperlink>
+        </w:p>
+        <w:p>
+          <w:pPr>
+            <w:rPr>
+              <w:b/>
+              <w:bCs/>
+              <w:noProof/>
+            </w:rPr>
+          </w:pPr>
+          <w:r>
+            <w:fldChar w:fldCharType="end"/>
+          </w:r>
+        </w:p>
+      </w:sdtContent>
+    </w:sdt>
+    <w:p>
+      <w:pPr>
+        <w:rPr>
+          <w:b/>
+          <w:bCs/>
+          <w:noProof/>
+        </w:rPr>
+      </w:pPr>
+      <w:r>
+        <w:rPr>
+          <w:b/>
+          <w:bCs/>
+          <w:noProof/>
+        </w:rPr>
+        <w:br w:type="page"/>
+      </w:r>
+    </w:p>
+    <w:p>
+      <w:pPr>
+        <w:pStyle w:val="Heading1"/>
+      </w:pPr>
+      <w:bookmarkStart w:id="0" w:name="_Toc236000089"/>
       <w:r>
         <w:lastRenderedPageBreak/>
-        <w:t>MSET</w:t>
-      </w:r>
-    </w:p>
-    <w:p>
-      <w:pPr>
-        <w:pStyle w:val="21QDCLIENTEDESIGNAODOPROJETO"/>
-      </w:pPr>
-      <w:r>
-        <w:t>ESTATUTOS ASSOCIATIVOS MSET</w:t>
-      </w:r>
-    </w:p>
-    <w:p>
-      <w:pPr>
-        <w:pStyle w:val="21QDCLIENTEDESIGNAODOPROJETO"/>
-      </w:pPr>
-      <w:r>
-        <w:t>PROPOSTA</w:t>
-      </w:r>
-    </w:p>
-    <w:p>
-      <w:pPr>
-        <w:pStyle w:val="21QDCLIENTEDESIGNAODOPROJETO"/>
-      </w:pPr>
-      <w:r>
-        <w:t>ASSOCIATIVO</w:t>
-      </w:r>
-    </w:p>
-    <w:p>
-      <w:pPr>
-        <w:pStyle w:val="21QDCLIENTEDESIGNAODOPROJETO"/>
-      </w:pPr>
-      <w:r>
-        <w:t>RUI ALVES</w:t>
-      </w:r>
-    </w:p>
-    <w:p>
-      <w:pPr>
-        <w:pStyle w:val="Heading1"/>
-      </w:pPr>
-      <w:r>
         <w:t>GENERALIDADES</w:t>
       </w:r>
+      <w:bookmarkEnd w:id="0"/>
     </w:p>
     <w:p>
       <w:pPr>
@@ -567,9 +2960,11 @@
       <w:r>
         <w:br/>
       </w:r>
+      <w:bookmarkStart w:id="1" w:name="_Toc236000090"/>
       <w:r>
         <w:t>DENOMINAÇÃO, SEDE E DURAÇÃO</w:t>
       </w:r>
+      <w:bookmarkEnd w:id="1"/>
     </w:p>
     <w:p>
       <w:pPr>
@@ -582,7 +2977,31 @@
         <w:rPr>
           <w:lang w:val="pt-PT"/>
         </w:rPr>
-        <w:t>A associação adota a denominação Associação Recreativa Cultural Mindset (adiante Mindset), é uma pessoa coletiva de direito privado, sem fins lucrativos, e rege-se pelos presentes estatutos, pelo regulamento interno e, no que for omisso, pela lei geral, designadamente pelos artigos 157.º e seguintes do Código Civil.</w:t>
+        <w:t xml:space="preserve">A associação adota a denominação Associação Recreativa Cultural Mindset (adiante </w:t>
+      </w:r>
+      <w:r>
+        <w:rPr>
+          <w:lang w:val="pt-PT"/>
+        </w:rPr>
+        <w:t>“</w:t>
+      </w:r>
+      <w:r>
+        <w:rPr>
+          <w:lang w:val="pt-PT"/>
+        </w:rPr>
+        <w:t>Mindset</w:t>
+      </w:r>
+      <w:r>
+        <w:rPr>
+          <w:lang w:val="pt-PT"/>
+        </w:rPr>
+        <w:t>”</w:t>
+      </w:r>
+      <w:r>
+        <w:rPr>
+          <w:lang w:val="pt-PT"/>
+        </w:rPr>
+        <w:t>), é uma pessoa coletiva de direito privado, sem fins lucrativos, e rege-se pelos presentes estatutos, pelo regulamento interno e, no que for omisso, pela lei geral, designadamente pelos artigos 157.º e seguintes do Código Civil.</w:t>
       </w:r>
     </w:p>
     <w:p>
@@ -651,11 +3070,16 @@
         <w:pStyle w:val="Heading2"/>
       </w:pPr>
       <w:r>
+        <w:rPr>
+          <w:lang w:val="pt-PT"/>
+        </w:rPr>
         <w:br/>
       </w:r>
+      <w:bookmarkStart w:id="2" w:name="_Toc236000091"/>
       <w:r>
         <w:t>FINS</w:t>
       </w:r>
+      <w:bookmarkEnd w:id="2"/>
     </w:p>
     <w:p>
       <w:pPr>
@@ -750,7 +3174,6 @@
         <w:rPr>
           <w:lang w:val="pt-PT"/>
         </w:rPr>
-        <w:lastRenderedPageBreak/>
         <w:t>Contribuir para a valorização e a profissionalização da atividade técnica na área do</w:t>
       </w:r>
       <w:r>
@@ -787,12 +3210,14 @@
         </w:rPr>
         <w:br/>
       </w:r>
+      <w:bookmarkStart w:id="3" w:name="_Toc236000092"/>
       <w:r>
         <w:rPr>
           <w:lang w:val="pt-PT"/>
         </w:rPr>
         <w:t>Atividades e meios</w:t>
       </w:r>
+      <w:bookmarkEnd w:id="3"/>
     </w:p>
     <w:p>
       <w:pPr>
@@ -820,19 +3245,8 @@
         <w:rPr>
           <w:lang w:val="pt-PT"/>
         </w:rPr>
-        <w:t xml:space="preserve">Aluguer e cedência de equipamento de </w:t>
-      </w:r>
-      <w:r>
-        <w:rPr>
-          <w:lang w:val="pt-PT"/>
-        </w:rPr>
-        <w:t>audiovisuais</w:t>
-      </w:r>
-      <w:r>
-        <w:rPr>
-          <w:lang w:val="pt-PT"/>
-        </w:rPr>
-        <w:t xml:space="preserve"> e afins, incluindo a respetiva montagem, operação e mão de obra técnica;</w:t>
+        <w:lastRenderedPageBreak/>
+        <w:t>Aluguer e cedência de equipamento de audiovisuais e afins, incluindo a respetiva montagem, operação e mão de obra técnica;</w:t>
       </w:r>
     </w:p>
     <w:p>
@@ -921,12 +3335,14 @@
         </w:rPr>
         <w:br/>
       </w:r>
+      <w:bookmarkStart w:id="4" w:name="_Toc236000093"/>
       <w:r>
         <w:rPr>
           <w:lang w:val="pt-PT"/>
         </w:rPr>
         <w:t>Ausência de fins lucrativos e não distribuição de resultados</w:t>
       </w:r>
+      <w:bookmarkEnd w:id="4"/>
     </w:p>
     <w:p>
       <w:pPr>
@@ -1049,6 +3465,19 @@
         </w:rPr>
         <w:t>As atividades referidas no número anterior são exercidas como meio de realização dos fins estatutários e não como fim em si mesmas.</w:t>
       </w:r>
+    </w:p>
+    <w:p>
+      <w:pPr>
+        <w:pStyle w:val="Heading4"/>
+        <w:numPr>
+          <w:ilvl w:val="0"/>
+          <w:numId w:val="0"/>
+        </w:numPr>
+        <w:ind w:left="1728"/>
+        <w:rPr>
+          <w:lang w:val="pt-PT"/>
+        </w:rPr>
+      </w:pPr>
     </w:p>
     <w:p>
       <w:pPr>
@@ -1066,26 +3495,103 @@
         </w:rPr>
         <w:br/>
       </w:r>
+      <w:bookmarkStart w:id="5" w:name="_Toc236000094"/>
       <w:r>
         <w:rPr>
           <w:lang w:val="pt-PT"/>
         </w:rPr>
         <w:t>Ausência de fins lucrativos e não distribuição de resultados</w:t>
       </w:r>
-      <w:r>
-        <w:rPr>
+      <w:bookmarkEnd w:id="5"/>
+    </w:p>
+    <w:p>
+      <w:pPr>
+        <w:pStyle w:val="Heading3"/>
+        <w:rPr>
+          <w:lang w:val="pt-PT"/>
+        </w:rPr>
+      </w:pPr>
+      <w:r>
+        <w:rPr>
+          <w:rStyle w:val="Heading3Char"/>
+          <w:lang w:val="pt-PT"/>
+        </w:rPr>
+        <w:t>A Associação não tem fins lucrativos e não pode distribuir, direta ou indiretamente, resultados, excedentes ou património pelos seus associados, dirigentes ou terceiros a eles equiparados.</w:t>
+      </w:r>
+      <w:r>
+        <w:rPr>
+          <w:rStyle w:val="Heading3Char"/>
           <w:lang w:val="pt-PT"/>
         </w:rPr>
         <w:br/>
       </w:r>
-      <w:r>
-        <w:rPr>
-          <w:rStyle w:val="Heading3Char"/>
+    </w:p>
+    <w:p>
+      <w:pPr>
+        <w:pStyle w:val="Heading3"/>
+        <w:rPr>
+          <w:lang w:val="pt-PT"/>
+        </w:rPr>
+      </w:pPr>
+      <w:r>
+        <w:rPr>
+          <w:lang w:val="pt-PT"/>
+        </w:rPr>
+        <w:t>Os eventuais excedentes apurados em cada exercício são integralmente afetos à realização dos fins estatutários.</w:t>
+      </w:r>
+    </w:p>
+    <w:p>
+      <w:pPr>
+        <w:pStyle w:val="Heading3"/>
+        <w:rPr>
+          <w:lang w:val="pt-PT"/>
+        </w:rPr>
+      </w:pPr>
+      <w:r>
+        <w:rPr>
+          <w:lang w:val="pt-PT"/>
+        </w:rPr>
+        <w:t>O disposto nos números anteriores não impede a Associação de remunerar, em condições de mercado, bens ou serviços que lhe sejam efetivamente prestados, incluindo por associados, nos termos do regulamento interno.</w:t>
+      </w:r>
+    </w:p>
+    <w:p>
+      <w:pPr>
+        <w:pStyle w:val="Heading1"/>
+        <w:rPr>
+          <w:lang w:val="pt-PT"/>
+        </w:rPr>
+      </w:pPr>
+      <w:bookmarkStart w:id="6" w:name="_Toc236000095"/>
+      <w:r>
+        <w:rPr>
           <w:lang w:val="pt-PT"/>
         </w:rPr>
         <w:lastRenderedPageBreak/>
+        <w:t>Associados</w:t>
+      </w:r>
+      <w:bookmarkEnd w:id="6"/>
+    </w:p>
+    <w:p>
+      <w:pPr>
+        <w:pStyle w:val="Heading2"/>
+        <w:rPr>
+          <w:lang w:val="pt-PT"/>
+        </w:rPr>
+      </w:pPr>
+      <w:r>
+        <w:rPr>
+          <w:lang w:val="pt-PT"/>
+        </w:rPr>
         <w:br/>
       </w:r>
+      <w:bookmarkStart w:id="7" w:name="_Toc236000096"/>
+      <w:r>
+        <w:rPr>
+          <w:lang w:val="pt-PT"/>
+        </w:rPr>
+        <w:t>Categorias de associados</w:t>
+      </w:r>
+      <w:bookmarkEnd w:id="7"/>
     </w:p>
     <w:p>
       <w:pPr>
@@ -1096,210 +3602,74 @@
       </w:pPr>
       <w:r>
         <w:rPr>
-          <w:rStyle w:val="Heading3Char"/>
-          <w:lang w:val="pt-PT"/>
-        </w:rPr>
-        <w:t>A Associação não tem fins lucrativos e não pode distribuir, direta ou indiretamente, resultados, excedentes ou património pelos seus associados, dirigentes ou terceiros a eles equiparados.</w:t>
-      </w:r>
-      <w:r>
-        <w:rPr>
-          <w:rStyle w:val="Heading3Char"/>
+          <w:lang w:val="pt-PT"/>
+        </w:rPr>
+        <w:t>A Associação tem as seguintes categorias de associados:</w:t>
+      </w:r>
+    </w:p>
+    <w:p>
+      <w:pPr>
+        <w:pStyle w:val="Heading4"/>
+        <w:rPr>
+          <w:lang w:val="pt-PT"/>
+        </w:rPr>
+      </w:pPr>
+      <w:r>
+        <w:rPr>
+          <w:lang w:val="pt-PT"/>
+        </w:rPr>
+        <w:t>Fundadores - os que subscreveram o ato de constituição;</w:t>
+      </w:r>
+    </w:p>
+    <w:p>
+      <w:pPr>
+        <w:pStyle w:val="Heading4"/>
+        <w:rPr>
+          <w:lang w:val="pt-PT"/>
+        </w:rPr>
+      </w:pPr>
+      <w:r>
+        <w:rPr>
+          <w:lang w:val="pt-PT"/>
+        </w:rPr>
+        <w:t>Efetivos - as pessoas singulares ou coletivas admitidas após a constituição, nos termos destes estatutos e do regulamento interno;</w:t>
+      </w:r>
+    </w:p>
+    <w:p>
+      <w:pPr>
+        <w:pStyle w:val="Heading4"/>
+        <w:rPr>
+          <w:lang w:val="pt-PT"/>
+        </w:rPr>
+      </w:pPr>
+      <w:r>
+        <w:rPr>
+          <w:lang w:val="pt-PT"/>
+        </w:rPr>
+        <w:t>Honorários - as pessoas singulares ou coletivas a quem a Assembleia Geral atribua essa distinção por serviços relevantes prestados à Associação.</w:t>
+      </w:r>
+    </w:p>
+    <w:p>
+      <w:pPr>
+        <w:pStyle w:val="Heading2"/>
+        <w:rPr>
+          <w:lang w:val="pt-PT"/>
+        </w:rPr>
+      </w:pPr>
+      <w:r>
+        <w:rPr>
           <w:lang w:val="pt-PT"/>
         </w:rPr>
         <w:br/>
       </w:r>
-    </w:p>
-    <w:p>
-      <w:pPr>
-        <w:pStyle w:val="Heading3"/>
-        <w:rPr>
-          <w:lang w:val="pt-PT"/>
-        </w:rPr>
-      </w:pPr>
-      <w:r>
-        <w:rPr>
-          <w:lang w:val="pt-PT"/>
-        </w:rPr>
-        <w:t>Os eventuais excedentes apurados em cada exercício são integralmente afetos à realização dos fins estatutários.</w:t>
-      </w:r>
-    </w:p>
-    <w:p>
-      <w:pPr>
-        <w:pStyle w:val="Heading3"/>
-        <w:rPr>
-          <w:lang w:val="pt-PT"/>
-        </w:rPr>
-      </w:pPr>
-      <w:r>
-        <w:rPr>
-          <w:lang w:val="pt-PT"/>
-        </w:rPr>
-        <w:t>O disposto nos números anteriores não impede a Associação de remunerar, em condições de mercado, bens ou serviços que lhe sejam efetivamente prestados, incluindo por associados, nos termos do regulamento interno.</w:t>
-      </w:r>
-    </w:p>
-    <w:p>
-      <w:pPr>
-        <w:pStyle w:val="Heading1"/>
-        <w:rPr>
-          <w:lang w:val="pt-PT"/>
-        </w:rPr>
-      </w:pPr>
-      <w:r>
-        <w:rPr>
-          <w:lang w:val="pt-PT"/>
-        </w:rPr>
-        <w:t>Associados</w:t>
-      </w:r>
-    </w:p>
-    <w:p>
-      <w:pPr>
-        <w:pStyle w:val="Heading2"/>
-        <w:rPr>
-          <w:lang w:val="pt-PT"/>
-        </w:rPr>
-      </w:pPr>
-      <w:r>
-        <w:rPr>
-          <w:lang w:val="pt-PT"/>
-        </w:rPr>
-        <w:br/>
-      </w:r>
-      <w:r>
-        <w:rPr>
-          <w:lang w:val="pt-PT"/>
-        </w:rPr>
-        <w:t>Categorias de associados</w:t>
-      </w:r>
-      <w:r>
-        <w:rPr>
-          <w:lang w:val="pt-PT"/>
-        </w:rPr>
-        <w:t>~</w:t>
-      </w:r>
-    </w:p>
-    <w:p>
-      <w:pPr>
-        <w:pStyle w:val="Heading3"/>
-        <w:rPr>
-          <w:lang w:val="pt-PT"/>
-        </w:rPr>
-      </w:pPr>
-      <w:r>
-        <w:rPr>
-          <w:lang w:val="pt-PT"/>
-        </w:rPr>
-        <w:t>A Associação tem as seguintes categorias de associados:</w:t>
-      </w:r>
-    </w:p>
-    <w:p>
-      <w:pPr>
-        <w:pStyle w:val="Heading4"/>
-        <w:rPr>
-          <w:highlight w:val="yellow"/>
-          <w:lang w:val="pt-PT"/>
-        </w:rPr>
-      </w:pPr>
-      <w:r>
-        <w:rPr>
-          <w:highlight w:val="yellow"/>
-          <w:lang w:val="pt-PT"/>
-        </w:rPr>
-        <w:t xml:space="preserve">Fundadores </w:t>
-      </w:r>
-      <w:r>
-        <w:rPr>
-          <w:highlight w:val="yellow"/>
-          <w:lang w:val="pt-PT"/>
-        </w:rPr>
-        <w:t>-</w:t>
-      </w:r>
-      <w:r>
-        <w:rPr>
-          <w:highlight w:val="yellow"/>
-          <w:lang w:val="pt-PT"/>
-        </w:rPr>
-        <w:t xml:space="preserve"> os que subscreveram o ato de constituição;</w:t>
-      </w:r>
-    </w:p>
-    <w:p>
-      <w:pPr>
-        <w:pStyle w:val="Heading4"/>
-        <w:rPr>
-          <w:highlight w:val="yellow"/>
-          <w:lang w:val="pt-PT"/>
-        </w:rPr>
-      </w:pPr>
-      <w:r>
-        <w:rPr>
-          <w:highlight w:val="yellow"/>
-          <w:lang w:val="pt-PT"/>
-        </w:rPr>
-        <w:t xml:space="preserve">Efetivos </w:t>
-      </w:r>
-      <w:r>
-        <w:rPr>
-          <w:highlight w:val="yellow"/>
-          <w:lang w:val="pt-PT"/>
-        </w:rPr>
-        <w:t>-</w:t>
-      </w:r>
-      <w:r>
-        <w:rPr>
-          <w:highlight w:val="yellow"/>
-          <w:lang w:val="pt-PT"/>
-        </w:rPr>
-        <w:t xml:space="preserve"> as pessoas singulares ou coletivas admitidas após a constituição, nos termos destes estatutos e do regulamento interno;</w:t>
-      </w:r>
-    </w:p>
-    <w:p>
-      <w:pPr>
-        <w:pStyle w:val="Heading4"/>
-        <w:rPr>
-          <w:highlight w:val="yellow"/>
-          <w:lang w:val="pt-PT"/>
-        </w:rPr>
-      </w:pPr>
-      <w:r>
-        <w:rPr>
-          <w:highlight w:val="yellow"/>
-          <w:lang w:val="pt-PT"/>
-        </w:rPr>
-        <w:t xml:space="preserve">Honorários </w:t>
-      </w:r>
-      <w:r>
-        <w:rPr>
-          <w:highlight w:val="yellow"/>
-          <w:lang w:val="pt-PT"/>
-        </w:rPr>
-        <w:t>-</w:t>
-      </w:r>
-      <w:r>
-        <w:rPr>
-          <w:highlight w:val="yellow"/>
-          <w:lang w:val="pt-PT"/>
-        </w:rPr>
-        <w:t xml:space="preserve"> as pessoas singulares ou coletivas a quem a Assembleia Geral atribua essa distinção por serviços relevantes prestados à Associação.</w:t>
-      </w:r>
-    </w:p>
-    <w:p>
-      <w:pPr>
-        <w:pStyle w:val="Heading2"/>
-        <w:rPr>
-          <w:lang w:val="pt-PT"/>
-        </w:rPr>
-      </w:pPr>
-      <w:r>
-        <w:rPr>
-          <w:lang w:val="pt-PT"/>
-        </w:rPr>
-        <w:br/>
-      </w:r>
+      <w:bookmarkStart w:id="8" w:name="_Toc236000097"/>
       <w:r>
         <w:rPr>
           <w:lang w:val="pt-PT"/>
         </w:rPr>
         <w:t>Admissão</w:t>
       </w:r>
+      <w:bookmarkEnd w:id="8"/>
     </w:p>
     <w:p>
       <w:pPr>
@@ -1345,6 +3715,7 @@
         </w:rPr>
         <w:br/>
       </w:r>
+      <w:bookmarkStart w:id="9" w:name="_Toc236000098"/>
       <w:r>
         <w:rPr>
           <w:rStyle w:val="Heading2Char"/>
@@ -1353,6 +3724,7 @@
         </w:rPr>
         <w:t>Direitos dos associados</w:t>
       </w:r>
+      <w:bookmarkEnd w:id="9"/>
     </w:p>
     <w:p>
       <w:pPr>
@@ -1361,6 +3733,7 @@
           <w:lang w:val="pt-PT"/>
         </w:rPr>
       </w:pPr>
+      <w:bookmarkStart w:id="10" w:name="_Toc236000099"/>
       <w:r>
         <w:rPr>
           <w:rStyle w:val="Heading2Char"/>
@@ -1370,6 +3743,7 @@
         </w:rPr>
         <w:t>São direitos dos associados no pleno gozo dos seus direitos:</w:t>
       </w:r>
+      <w:bookmarkEnd w:id="10"/>
       <w:r>
         <w:rPr>
           <w:rStyle w:val="Heading2Char"/>
@@ -1419,8 +3793,119 @@
         <w:rPr>
           <w:lang w:val="pt-PT"/>
         </w:rPr>
+        <w:t>Participar nas atividades da Associação;</w:t>
+      </w:r>
+    </w:p>
+    <w:p>
+      <w:pPr>
+        <w:pStyle w:val="Heading4"/>
+        <w:rPr>
+          <w:lang w:val="pt-PT"/>
+        </w:rPr>
+      </w:pPr>
+      <w:r>
+        <w:rPr>
+          <w:lang w:val="pt-PT"/>
+        </w:rPr>
+        <w:t>Examinar as contas e a documentação da Associação nos períodos e condições fixados no regulamento interno.</w:t>
+      </w:r>
+    </w:p>
+    <w:p>
+      <w:pPr>
+        <w:pStyle w:val="Heading3"/>
+        <w:rPr>
+          <w:lang w:val="pt-PT"/>
+        </w:rPr>
+      </w:pPr>
+      <w:r>
+        <w:rPr>
+          <w:lang w:val="pt-PT"/>
+        </w:rPr>
+        <w:t>Os associados honorários</w:t>
+      </w:r>
+      <w:r>
+        <w:rPr>
+          <w:lang w:val="pt-PT"/>
+        </w:rPr>
+        <w:t xml:space="preserve"> </w:t>
+      </w:r>
+      <w:r>
+        <w:rPr>
+          <w:highlight w:val="cyan"/>
+          <w:lang w:val="pt-PT"/>
+        </w:rPr>
+        <w:t>e coletivos</w:t>
+      </w:r>
+      <w:r>
+        <w:rPr>
+          <w:lang w:val="pt-PT"/>
+        </w:rPr>
+        <w:t xml:space="preserve"> não estão sujeitos ao pagamento de quotas e não têm direito de voto, salvo se acumularem a qualidade de associados efetivos.</w:t>
+      </w:r>
+    </w:p>
+    <w:p>
+      <w:pPr>
+        <w:pStyle w:val="Heading2"/>
+        <w:rPr>
+          <w:lang w:val="pt-PT"/>
+        </w:rPr>
+      </w:pPr>
+      <w:r>
+        <w:rPr>
+          <w:lang w:val="pt-PT"/>
+        </w:rPr>
+        <w:br/>
+      </w:r>
+      <w:bookmarkStart w:id="11" w:name="_Toc236000100"/>
+      <w:r>
+        <w:rPr>
+          <w:lang w:val="pt-PT"/>
+        </w:rPr>
+        <w:t>Deveres dos associados</w:t>
+      </w:r>
+      <w:bookmarkEnd w:id="11"/>
+    </w:p>
+    <w:p>
+      <w:pPr>
+        <w:pStyle w:val="Heading3"/>
+        <w:rPr>
+          <w:lang w:val="pt-PT"/>
+        </w:rPr>
+      </w:pPr>
+      <w:r>
+        <w:rPr>
+          <w:lang w:val="pt-PT"/>
+        </w:rPr>
+        <w:t>São deveres dos associados:</w:t>
+      </w:r>
+    </w:p>
+    <w:p>
+      <w:pPr>
+        <w:pStyle w:val="Heading4"/>
+        <w:rPr>
+          <w:lang w:val="pt-PT"/>
+        </w:rPr>
+      </w:pPr>
+      <w:r>
+        <w:rPr>
+          <w:lang w:val="pt-PT"/>
+        </w:rPr>
+        <w:t>Cumprir os estatutos, o regulamento interno e as deliberações dos órgãos sociais;</w:t>
+      </w:r>
+    </w:p>
+    <w:p>
+      <w:pPr>
+        <w:pStyle w:val="Heading4"/>
+        <w:rPr>
+          <w:lang w:val="pt-PT"/>
+        </w:rPr>
+      </w:pPr>
+      <w:r>
+        <w:rPr>
+          <w:lang w:val="pt-PT"/>
+        </w:rPr>
         <w:lastRenderedPageBreak/>
-        <w:t>Participar nas atividades da Associação;</w:t>
+        <w:t>Pagar pontualmente a joia e as quotas, quando devidas;</w:t>
       </w:r>
     </w:p>
     <w:p>
@@ -1434,40 +3919,21 @@
         <w:rPr>
           <w:lang w:val="pt-PT"/>
         </w:rPr>
-        <w:t>Examinar as contas e a documentação da Associação nos períodos e condições fixados no regulamento interno.</w:t>
-      </w:r>
-    </w:p>
-    <w:p>
-      <w:pPr>
-        <w:pStyle w:val="Heading3"/>
-        <w:rPr>
-          <w:lang w:val="pt-PT"/>
-        </w:rPr>
-      </w:pPr>
-      <w:r>
-        <w:rPr>
-          <w:lang w:val="pt-PT"/>
-        </w:rPr>
-        <w:t>Os associados honorários</w:t>
-      </w:r>
-      <w:r>
-        <w:rPr>
-          <w:lang w:val="pt-PT"/>
-        </w:rPr>
-        <w:t xml:space="preserve"> </w:t>
-      </w:r>
-      <w:r>
-        <w:rPr>
-          <w:highlight w:val="cyan"/>
-          <w:lang w:val="pt-PT"/>
-        </w:rPr>
-        <w:t>e coletivos</w:t>
-      </w:r>
-      <w:r>
-        <w:rPr>
-          <w:lang w:val="pt-PT"/>
-        </w:rPr>
-        <w:t xml:space="preserve"> não estão sujeitos ao pagamento de quotas e não têm direito de voto, salvo se acumularem a qualidade de associados efetivos.</w:t>
+        <w:t>Exercer com zelo os cargos para que forem eleitos;</w:t>
+      </w:r>
+    </w:p>
+    <w:p>
+      <w:pPr>
+        <w:pStyle w:val="Heading4"/>
+        <w:rPr>
+          <w:lang w:val="pt-PT"/>
+        </w:rPr>
+      </w:pPr>
+      <w:r>
+        <w:rPr>
+          <w:lang w:val="pt-PT"/>
+        </w:rPr>
+        <w:t>Contribuir para a boa realização dos fins da Associação e zelar pelo seu património.</w:t>
       </w:r>
     </w:p>
     <w:p>
@@ -1483,102 +3949,14 @@
         </w:rPr>
         <w:br/>
       </w:r>
-      <w:r>
-        <w:rPr>
-          <w:lang w:val="pt-PT"/>
-        </w:rPr>
-        <w:t>Deveres dos associados</w:t>
-      </w:r>
-    </w:p>
-    <w:p>
-      <w:pPr>
-        <w:pStyle w:val="Heading3"/>
-        <w:rPr>
-          <w:lang w:val="pt-PT"/>
-        </w:rPr>
-      </w:pPr>
-      <w:r>
-        <w:rPr>
-          <w:lang w:val="pt-PT"/>
-        </w:rPr>
-        <w:t>São deveres dos associados:</w:t>
-      </w:r>
-    </w:p>
-    <w:p>
-      <w:pPr>
-        <w:pStyle w:val="Heading4"/>
-        <w:rPr>
-          <w:lang w:val="pt-PT"/>
-        </w:rPr>
-      </w:pPr>
-      <w:r>
-        <w:rPr>
-          <w:lang w:val="pt-PT"/>
-        </w:rPr>
-        <w:t>Cumprir os estatutos, o regulamento interno e as deliberações dos órgãos sociais;</w:t>
-      </w:r>
-    </w:p>
-    <w:p>
-      <w:pPr>
-        <w:pStyle w:val="Heading4"/>
-        <w:rPr>
-          <w:lang w:val="pt-PT"/>
-        </w:rPr>
-      </w:pPr>
-      <w:r>
-        <w:rPr>
-          <w:lang w:val="pt-PT"/>
-        </w:rPr>
-        <w:t>Pagar pontualmente a joia e as quotas, quando devidas;</w:t>
-      </w:r>
-    </w:p>
-    <w:p>
-      <w:pPr>
-        <w:pStyle w:val="Heading4"/>
-        <w:rPr>
-          <w:lang w:val="pt-PT"/>
-        </w:rPr>
-      </w:pPr>
-      <w:r>
-        <w:rPr>
-          <w:lang w:val="pt-PT"/>
-        </w:rPr>
-        <w:t>Exercer com zelo os cargos para que forem eleitos;</w:t>
-      </w:r>
-    </w:p>
-    <w:p>
-      <w:pPr>
-        <w:pStyle w:val="Heading4"/>
-        <w:rPr>
-          <w:lang w:val="pt-PT"/>
-        </w:rPr>
-      </w:pPr>
-      <w:r>
-        <w:rPr>
-          <w:lang w:val="pt-PT"/>
-        </w:rPr>
-        <w:t>Contribuir para a boa realização dos fins da Associação e zelar pelo seu património.</w:t>
-      </w:r>
-    </w:p>
-    <w:p>
-      <w:pPr>
-        <w:pStyle w:val="Heading2"/>
-        <w:rPr>
-          <w:lang w:val="pt-PT"/>
-        </w:rPr>
-      </w:pPr>
-      <w:r>
-        <w:rPr>
-          <w:lang w:val="pt-PT"/>
-        </w:rPr>
-        <w:br/>
-      </w:r>
+      <w:bookmarkStart w:id="12" w:name="_Toc236000101"/>
       <w:r>
         <w:rPr>
           <w:lang w:val="pt-PT"/>
         </w:rPr>
         <w:t>Perda da qualidade de associado e sanções</w:t>
       </w:r>
+      <w:bookmarkEnd w:id="12"/>
     </w:p>
     <w:p>
       <w:pPr>
@@ -1641,12 +4019,14 @@
           <w:lang w:val="pt-PT"/>
         </w:rPr>
       </w:pPr>
+      <w:bookmarkStart w:id="13" w:name="_Toc236000102"/>
       <w:r>
         <w:rPr>
           <w:lang w:val="pt-PT"/>
         </w:rPr>
         <w:t>Órgãos Sociais</w:t>
       </w:r>
+      <w:bookmarkEnd w:id="13"/>
     </w:p>
     <w:p>
       <w:pPr>
@@ -1655,12 +4035,14 @@
           <w:lang w:val="pt-PT"/>
         </w:rPr>
       </w:pPr>
+      <w:bookmarkStart w:id="14" w:name="_Toc236000103"/>
       <w:r>
         <w:rPr>
           <w:lang w:val="pt-PT"/>
         </w:rPr>
         <w:t>Órgãos</w:t>
       </w:r>
+      <w:bookmarkEnd w:id="14"/>
     </w:p>
     <w:p>
       <w:pPr>
@@ -1728,15 +4110,355 @@
         <w:rPr>
           <w:lang w:val="pt-PT"/>
         </w:rPr>
+        <w:br/>
+      </w:r>
+      <w:bookmarkStart w:id="15" w:name="_Toc236000104"/>
+      <w:r>
+        <w:rPr>
+          <w:lang w:val="pt-PT"/>
+        </w:rPr>
+        <w:t>Mandato e gratuitidade</w:t>
+      </w:r>
+      <w:bookmarkEnd w:id="15"/>
+    </w:p>
+    <w:p>
+      <w:pPr>
+        <w:pStyle w:val="Heading3"/>
+        <w:rPr>
+          <w:lang w:val="pt-PT"/>
+        </w:rPr>
+      </w:pPr>
+      <w:r>
+        <w:rPr>
+          <w:lang w:val="pt-PT"/>
+        </w:rPr>
+        <w:t xml:space="preserve">Os titulares dos órgãos sociais são eleitos em Assembleia Geral por </w:t>
+      </w:r>
+      <w:r>
+        <w:rPr>
+          <w:lang w:val="pt-PT"/>
+        </w:rPr>
+        <w:t>mandatos de dois anos, sendo permitida a reeleição.</w:t>
+      </w:r>
+    </w:p>
+    <w:p>
+      <w:pPr>
+        <w:pStyle w:val="Heading3"/>
+        <w:rPr>
+          <w:lang w:val="pt-PT"/>
+        </w:rPr>
+      </w:pPr>
+      <w:r>
+        <w:rPr>
+          <w:lang w:val="pt-PT"/>
+        </w:rPr>
+        <w:t>O exercício de funções nos órgãos sociais é gratuito, sem prejuízo do reembolso de despesas devidamente documentadas e realizadas ao serviço da Associação.</w:t>
+      </w:r>
+    </w:p>
+    <w:p>
+      <w:pPr>
+        <w:pStyle w:val="Heading2"/>
+        <w:rPr>
+          <w:lang w:val="pt-PT"/>
+        </w:rPr>
+      </w:pPr>
+      <w:r>
+        <w:rPr>
+          <w:lang w:val="pt-PT"/>
+        </w:rPr>
+        <w:br/>
+      </w:r>
+      <w:bookmarkStart w:id="16" w:name="_Toc236000105"/>
+      <w:r>
+        <w:rPr>
+          <w:lang w:val="pt-PT"/>
+        </w:rPr>
+        <w:t>Assembleia Geral</w:t>
+      </w:r>
+      <w:bookmarkEnd w:id="16"/>
+    </w:p>
+    <w:p>
+      <w:pPr>
+        <w:pStyle w:val="Heading3"/>
+        <w:rPr>
+          <w:lang w:val="pt-PT"/>
+        </w:rPr>
+      </w:pPr>
+      <w:r>
+        <w:rPr>
+          <w:lang w:val="pt-PT"/>
+        </w:rPr>
         <w:lastRenderedPageBreak/>
+        <w:t>A Assembleia Geral é constituída por todos os associados no pleno gozo dos seus direitos e é o órgão máximo da Associação.</w:t>
+      </w:r>
+    </w:p>
+    <w:p>
+      <w:pPr>
+        <w:pStyle w:val="Heading3"/>
+        <w:rPr>
+          <w:lang w:val="pt-PT"/>
+        </w:rPr>
+      </w:pPr>
+      <w:r>
+        <w:rPr>
+          <w:lang w:val="pt-PT"/>
+        </w:rPr>
+        <w:t>Compete à Assembleia Geral, designadamente:</w:t>
+      </w:r>
+    </w:p>
+    <w:p>
+      <w:pPr>
+        <w:pStyle w:val="Heading4"/>
+        <w:rPr>
+          <w:lang w:val="pt-PT"/>
+        </w:rPr>
+      </w:pPr>
+      <w:r>
+        <w:rPr>
+          <w:lang w:val="pt-PT"/>
+        </w:rPr>
+        <w:t>eleger e destituir os titulares dos órgãos sociais;</w:t>
+      </w:r>
+    </w:p>
+    <w:p>
+      <w:pPr>
+        <w:pStyle w:val="Heading4"/>
+        <w:rPr>
+          <w:lang w:val="pt-PT"/>
+        </w:rPr>
+      </w:pPr>
+      <w:r>
+        <w:rPr>
+          <w:lang w:val="pt-PT"/>
+        </w:rPr>
+        <w:t>aprovar o plano de atividades e o orçamento</w:t>
+      </w:r>
+      <w:r>
+        <w:rPr>
+          <w:lang w:val="pt-PT"/>
+        </w:rPr>
+        <w:t>, o relatório de atividades</w:t>
+      </w:r>
+      <w:r>
+        <w:rPr>
+          <w:lang w:val="pt-PT"/>
+        </w:rPr>
+        <w:t xml:space="preserve"> e </w:t>
+      </w:r>
+      <w:r>
+        <w:rPr>
+          <w:lang w:val="pt-PT"/>
+        </w:rPr>
+        <w:t xml:space="preserve">rever </w:t>
+      </w:r>
+      <w:r>
+        <w:rPr>
+          <w:lang w:val="pt-PT"/>
+        </w:rPr>
+        <w:t xml:space="preserve">as contas do exercício; </w:t>
+      </w:r>
+    </w:p>
+    <w:p>
+      <w:pPr>
+        <w:pStyle w:val="Heading4"/>
+        <w:rPr>
+          <w:lang w:val="pt-PT"/>
+        </w:rPr>
+      </w:pPr>
+      <w:r>
+        <w:rPr>
+          <w:lang w:val="pt-PT"/>
+        </w:rPr>
+        <w:t>fixar o valor da joia e das quotas;</w:t>
+      </w:r>
+    </w:p>
+    <w:p>
+      <w:pPr>
+        <w:pStyle w:val="Heading4"/>
+        <w:rPr>
+          <w:lang w:val="pt-PT"/>
+        </w:rPr>
+      </w:pPr>
+      <w:r>
+        <w:rPr>
+          <w:lang w:val="pt-PT"/>
+        </w:rPr>
+        <w:t>alterar os estatutos;</w:t>
+      </w:r>
+    </w:p>
+    <w:p>
+      <w:pPr>
+        <w:pStyle w:val="Heading4"/>
+        <w:rPr>
+          <w:lang w:val="pt-PT"/>
+        </w:rPr>
+      </w:pPr>
+      <w:r>
+        <w:rPr>
+          <w:lang w:val="pt-PT"/>
+        </w:rPr>
+        <w:t xml:space="preserve"> aprovar o regulamento interno; </w:t>
+      </w:r>
+    </w:p>
+    <w:p>
+      <w:pPr>
+        <w:pStyle w:val="Heading4"/>
+        <w:rPr>
+          <w:lang w:val="pt-PT"/>
+        </w:rPr>
+      </w:pPr>
+      <w:r>
+        <w:rPr>
+          <w:lang w:val="pt-PT"/>
+        </w:rPr>
+        <w:t>deliberar sobre a exclusão de associados e sobre a dissolução da Associação.</w:t>
+      </w:r>
+    </w:p>
+    <w:p>
+      <w:pPr>
+        <w:pStyle w:val="Heading3"/>
+        <w:rPr>
+          <w:lang w:val="pt-PT"/>
+        </w:rPr>
+      </w:pPr>
+      <w:r>
+        <w:rPr>
+          <w:lang w:val="pt-PT"/>
+        </w:rPr>
+        <w:t>A Assembleia Geral reúne em sessão ordinária, ao menos duas vezes por ano, para apreciação e votação do relatório e contas</w:t>
+      </w:r>
+      <w:r>
+        <w:rPr>
+          <w:lang w:val="pt-PT"/>
+        </w:rPr>
+        <w:t>,</w:t>
+      </w:r>
+      <w:r>
+        <w:rPr>
+          <w:lang w:val="pt-PT"/>
+        </w:rPr>
+        <w:t xml:space="preserve"> orçamento</w:t>
+      </w:r>
+      <w:r>
+        <w:rPr>
+          <w:lang w:val="pt-PT"/>
+        </w:rPr>
+        <w:t>, plano de atividades, e do relatório de atividades, com  convocatória realizada com antecedência mínima de 8 dias</w:t>
+      </w:r>
+      <w:r>
+        <w:rPr>
+          <w:lang w:val="pt-PT"/>
+        </w:rPr>
+        <w:t>.</w:t>
+      </w:r>
+    </w:p>
+    <w:p>
+      <w:pPr>
+        <w:pStyle w:val="Heading3"/>
+        <w:rPr>
+          <w:lang w:val="pt-PT"/>
+        </w:rPr>
+      </w:pPr>
+      <w:r>
+        <w:rPr>
+          <w:lang w:val="pt-PT"/>
+        </w:rPr>
+        <w:t xml:space="preserve">Reúne extraordinariamente por iniciativa da Mesa, a pedido da Direção, do Conselho Fiscal ou de um conjunto de associados não inferior a </w:t>
+      </w:r>
+      <w:r>
+        <w:rPr>
+          <w:lang w:val="pt-PT"/>
+        </w:rPr>
+        <w:t>um quinto da totalidade</w:t>
+      </w:r>
+      <w:r>
+        <w:rPr>
+          <w:lang w:val="pt-PT"/>
+        </w:rPr>
+        <w:t>, com  convocatória realizada com antecedência mínima de 8 dias</w:t>
+      </w:r>
+      <w:r>
+        <w:rPr>
+          <w:lang w:val="pt-PT"/>
+        </w:rPr>
+        <w:t>.</w:t>
+      </w:r>
+    </w:p>
+    <w:p>
+      <w:pPr>
+        <w:pStyle w:val="Heading3"/>
+        <w:rPr>
+          <w:lang w:val="pt-PT"/>
+        </w:rPr>
+      </w:pPr>
+      <w:r>
+        <w:rPr>
+          <w:lang w:val="pt-PT"/>
+        </w:rPr>
+        <w:t>Em primeira convocação, a Assembleia Geral só pode deliberar com a presença de, pelo menos, metade dos associados; em segunda convocação, decorridos trinta</w:t>
+      </w:r>
+      <w:r>
+        <w:rPr>
+          <w:lang w:val="pt-PT"/>
+        </w:rPr>
+        <w:t xml:space="preserve"> </w:t>
+      </w:r>
+      <w:r>
+        <w:rPr>
+          <w:lang w:val="pt-PT"/>
+        </w:rPr>
+        <w:t>minutos, delibera com qualquer número de presentes.</w:t>
+      </w:r>
+    </w:p>
+    <w:p>
+      <w:pPr>
+        <w:pStyle w:val="Heading3"/>
+        <w:rPr>
+          <w:lang w:val="pt-PT"/>
+        </w:rPr>
+      </w:pPr>
+      <w:r>
+        <w:rPr>
+          <w:lang w:val="pt-PT"/>
+        </w:rPr>
+        <w:t>As deliberações são tomadas por maioria simples dos votos, salvo nos casos em que a lei ou os estatutos exijam maioria qualificada.</w:t>
+      </w:r>
+    </w:p>
+    <w:p>
+      <w:pPr>
+        <w:pStyle w:val="Heading3"/>
+        <w:rPr>
+          <w:lang w:val="pt-PT"/>
+        </w:rPr>
+      </w:pPr>
+      <w:r>
+        <w:rPr>
+          <w:lang w:val="pt-PT"/>
+        </w:rPr>
+        <w:t>A alteração dos estatutos exige o voto favorável de três quartos dos associados presentes; a dissolução exige o voto favorável de três quartos da totalidade dos associados.</w:t>
+      </w:r>
+    </w:p>
+    <w:p>
+      <w:pPr>
+        <w:pStyle w:val="Heading2"/>
+        <w:rPr>
+          <w:lang w:val="pt-PT"/>
+        </w:rPr>
+      </w:pPr>
+      <w:r>
+        <w:rPr>
+          <w:lang w:val="pt-PT"/>
+        </w:rPr>
         <w:br/>
       </w:r>
-      <w:r>
-        <w:rPr>
-          <w:lang w:val="pt-PT"/>
-        </w:rPr>
-        <w:t>Mandato e gratuitidade</w:t>
-      </w:r>
+      <w:bookmarkStart w:id="17" w:name="_Toc236000106"/>
+      <w:r>
+        <w:rPr>
+          <w:lang w:val="pt-PT"/>
+        </w:rPr>
+        <w:t>Mesa da Assembleia Geral</w:t>
+      </w:r>
+      <w:bookmarkEnd w:id="17"/>
     </w:p>
     <w:p>
       <w:pPr>
@@ -1745,182 +4467,14 @@
           <w:lang w:val="pt-PT"/>
         </w:rPr>
       </w:pPr>
-      <w:r>
-        <w:rPr>
-          <w:lang w:val="pt-PT"/>
-        </w:rPr>
-        <w:t xml:space="preserve">Os titulares dos órgãos sociais são eleitos em Assembleia Geral por </w:t>
-      </w:r>
-      <w:r>
-        <w:rPr>
-          <w:lang w:val="pt-PT"/>
-        </w:rPr>
-        <w:t>mandatos de dois</w:t>
-      </w:r>
-      <w:r>
-        <w:rPr>
-          <w:lang w:val="pt-PT"/>
-        </w:rPr>
-        <w:t xml:space="preserve"> </w:t>
-      </w:r>
-      <w:r>
-        <w:rPr>
-          <w:lang w:val="pt-PT"/>
-        </w:rPr>
-        <w:t>anos, sendo permitida a reeleição.</w:t>
-      </w:r>
-    </w:p>
-    <w:p>
-      <w:pPr>
-        <w:pStyle w:val="Heading3"/>
-        <w:rPr>
-          <w:lang w:val="pt-PT"/>
-        </w:rPr>
-      </w:pPr>
-      <w:r>
-        <w:rPr>
-          <w:lang w:val="pt-PT"/>
-        </w:rPr>
-        <w:t>O exercício de funções nos órgãos sociais é gratuito, sem prejuízo do reembolso de despesas devidamente documentadas e realizadas ao serviço da Associação.</w:t>
-      </w:r>
-    </w:p>
-    <w:p>
-      <w:pPr>
-        <w:pStyle w:val="Heading2"/>
-        <w:rPr>
-          <w:lang w:val="pt-PT"/>
-        </w:rPr>
-      </w:pPr>
-      <w:r>
-        <w:rPr>
-          <w:lang w:val="pt-PT"/>
-        </w:rPr>
-        <w:br/>
-      </w:r>
-      <w:r>
-        <w:rPr>
-          <w:lang w:val="pt-PT"/>
-        </w:rPr>
-        <w:t>Assembleia Geral</w:t>
-      </w:r>
-    </w:p>
-    <w:p>
-      <w:pPr>
-        <w:pStyle w:val="Heading3"/>
-        <w:rPr>
-          <w:lang w:val="pt-PT"/>
-        </w:rPr>
-      </w:pPr>
-      <w:r>
-        <w:rPr>
-          <w:lang w:val="pt-PT"/>
-        </w:rPr>
-        <w:t>A Assembleia Geral é constituída por todos os associados no pleno gozo dos seus direitos e é o órgão máximo da Associação.</w:t>
-      </w:r>
-    </w:p>
-    <w:p>
-      <w:pPr>
-        <w:pStyle w:val="Heading4"/>
-        <w:rPr>
-          <w:lang w:val="pt-PT"/>
-        </w:rPr>
-      </w:pPr>
-      <w:r>
-        <w:rPr>
-          <w:lang w:val="pt-PT"/>
-        </w:rPr>
-        <w:t>Compete à Assembleia Geral, designadamente:</w:t>
-      </w:r>
-    </w:p>
-    <w:p>
-      <w:pPr>
-        <w:pStyle w:val="Heading4"/>
-        <w:rPr>
-          <w:lang w:val="pt-PT"/>
-        </w:rPr>
-      </w:pPr>
-      <w:r>
-        <w:rPr>
-          <w:lang w:val="pt-PT"/>
-        </w:rPr>
-        <w:t>eleger e destituir os titulares dos órgãos sociais;</w:t>
-      </w:r>
-    </w:p>
-    <w:p>
-      <w:pPr>
-        <w:pStyle w:val="Heading4"/>
-        <w:rPr>
-          <w:lang w:val="pt-PT"/>
-        </w:rPr>
-      </w:pPr>
-      <w:r>
-        <w:rPr>
-          <w:lang w:val="pt-PT"/>
-        </w:rPr>
-        <w:t xml:space="preserve">aprovar o plano de atividades e o orçamento, o </w:t>
-      </w:r>
-      <w:r>
-        <w:rPr>
-          <w:lang w:val="pt-PT"/>
-        </w:rPr>
-        <w:t>plano de atividades, o relatório de atividades</w:t>
-      </w:r>
-      <w:r>
-        <w:rPr>
-          <w:lang w:val="pt-PT"/>
-        </w:rPr>
-        <w:t xml:space="preserve"> e as contas do exercício; </w:t>
-      </w:r>
-    </w:p>
-    <w:p>
-      <w:pPr>
-        <w:pStyle w:val="Heading4"/>
-        <w:rPr>
-          <w:lang w:val="pt-PT"/>
-        </w:rPr>
-      </w:pPr>
-      <w:r>
-        <w:rPr>
-          <w:lang w:val="pt-PT"/>
-        </w:rPr>
-        <w:t>fixar o valor da joia e das quotas; alterar os estatutos; aprovar o regulamento interno; deliberar sobre a exclusão de associados e sobre a dissolução da Associação.</w:t>
-      </w:r>
-    </w:p>
-    <w:p>
-      <w:pPr>
-        <w:pStyle w:val="Heading2"/>
-        <w:rPr>
-          <w:lang w:val="pt-PT"/>
-        </w:rPr>
-      </w:pPr>
-      <w:r>
-        <w:rPr>
-          <w:lang w:val="pt-PT"/>
-        </w:rPr>
-        <w:br/>
-      </w:r>
-      <w:r>
-        <w:rPr>
-          <w:lang w:val="pt-PT"/>
-        </w:rPr>
-        <w:t>Mesa da Assembleia Geral</w:t>
-      </w:r>
-    </w:p>
-    <w:p>
-      <w:pPr>
-        <w:pStyle w:val="Heading3"/>
-        <w:rPr>
-          <w:lang w:val="pt-PT"/>
-        </w:rPr>
-      </w:pPr>
-      <w:commentRangeStart w:id="0"/>
+      <w:commentRangeStart w:id="18"/>
       <w:r>
         <w:rPr>
           <w:lang w:val="pt-PT"/>
         </w:rPr>
         <w:t>A Mesa da Assembleia Geral é composta por um presidente e dois secretários, competindo-lhe convocar e dirigir as reuniões e lavrar as respetivas atas.</w:t>
       </w:r>
-      <w:commentRangeEnd w:id="0"/>
+      <w:commentRangeEnd w:id="18"/>
       <w:r>
         <w:rPr>
           <w:rStyle w:val="CommentReference"/>
@@ -1928,28 +4482,21 @@
           <w:szCs w:val="24"/>
           <w:lang w:val="pt-PT"/>
         </w:rPr>
-        <w:commentReference w:id="0"/>
+        <w:commentReference w:id="18"/>
       </w:r>
     </w:p>
     <w:p>
       <w:pPr>
         <w:pStyle w:val="Heading2"/>
-        <w:rPr>
-          <w:lang w:val="pt-PT"/>
-        </w:rPr>
-      </w:pPr>
-      <w:r>
-        <w:rPr>
-          <w:lang w:val="pt-PT"/>
-        </w:rPr>
+      </w:pPr>
+      <w:r>
         <w:br/>
       </w:r>
-      <w:r>
-        <w:rPr>
-          <w:lang w:val="pt-PT"/>
-        </w:rPr>
-        <w:t>Convocação e reuniões</w:t>
-      </w:r>
+      <w:bookmarkStart w:id="19" w:name="_Toc236000107"/>
+      <w:r>
+        <w:t>Conselho Fiscal</w:t>
+      </w:r>
+      <w:bookmarkEnd w:id="19"/>
     </w:p>
     <w:p>
       <w:pPr>
@@ -1962,7 +4509,7 @@
         <w:rPr>
           <w:lang w:val="pt-PT"/>
         </w:rPr>
-        <w:t>A Assembleia Geral reúne em sessão ordinária, ao menos duas vezes por ano, para apreciação e votação do relatório e contas e do plano e orçamento.</w:t>
+        <w:t>O Conselho Fiscal é composto por três membros, sendo um presidente, um secretário e um vogal.</w:t>
       </w:r>
     </w:p>
     <w:p>
@@ -1976,8 +4523,53 @@
         <w:rPr>
           <w:lang w:val="pt-PT"/>
         </w:rPr>
-        <w:t>Reúne extraordinariamente por iniciativa da Mesa, a pedido da Direção, do Conselho Fiscal ou de um conjunto de associados não inferior a um quinto da totalidade.</w:t>
-      </w:r>
+        <w:t>Compete-lhe fiscalizar os atos de administração, examinar a contabilidade e emitir parecer sobre o relatório e contas do exercício.</w:t>
+      </w:r>
+    </w:p>
+    <w:p>
+      <w:pPr>
+        <w:pStyle w:val="Heading1"/>
+        <w:rPr>
+          <w:lang w:val="pt-PT"/>
+        </w:rPr>
+      </w:pPr>
+      <w:bookmarkStart w:id="20" w:name="_Toc236000108"/>
+      <w:r>
+        <w:rPr>
+          <w:lang w:val="pt-PT"/>
+        </w:rPr>
+        <w:lastRenderedPageBreak/>
+        <w:t>R</w:t>
+      </w:r>
+      <w:r>
+        <w:rPr>
+          <w:lang w:val="pt-PT"/>
+        </w:rPr>
+        <w:t>egime Financeiro e Patrimonial</w:t>
+      </w:r>
+      <w:bookmarkEnd w:id="20"/>
+    </w:p>
+    <w:p>
+      <w:pPr>
+        <w:pStyle w:val="Heading2"/>
+        <w:rPr>
+          <w:lang w:val="pt-PT"/>
+        </w:rPr>
+      </w:pPr>
+      <w:r>
+        <w:rPr>
+          <w:lang w:val="pt-PT"/>
+        </w:rPr>
+        <w:br/>
+      </w:r>
+      <w:bookmarkStart w:id="21" w:name="_Toc236000109"/>
+      <w:r>
+        <w:rPr>
+          <w:lang w:val="pt-PT"/>
+        </w:rPr>
+        <w:t>Receitas</w:t>
+      </w:r>
+      <w:bookmarkEnd w:id="21"/>
     </w:p>
     <w:p>
       <w:pPr>
@@ -1990,7 +4582,335 @@
         <w:rPr>
           <w:lang w:val="pt-PT"/>
         </w:rPr>
-        <w:t>A convocatória é feita com a antecedência mínima de [oito] dias, por meio que assegure o conhecimento efetivo dos associados, com indicação de dia, hora, local e ordem de trabalhos.</w:t>
+        <w:t>Constituem receitas da Associação:</w:t>
+      </w:r>
+    </w:p>
+    <w:p>
+      <w:pPr>
+        <w:pStyle w:val="Heading4"/>
+        <w:rPr>
+          <w:lang w:val="pt-PT"/>
+        </w:rPr>
+      </w:pPr>
+      <w:r>
+        <w:rPr>
+          <w:lang w:val="pt-PT"/>
+        </w:rPr>
+        <w:t>A</w:t>
+      </w:r>
+      <w:r>
+        <w:rPr>
+          <w:lang w:val="pt-PT"/>
+        </w:rPr>
+        <w:t>s joias e as quotas dos associados;</w:t>
+      </w:r>
+    </w:p>
+    <w:p>
+      <w:pPr>
+        <w:pStyle w:val="Heading4"/>
+        <w:rPr>
+          <w:lang w:val="pt-PT"/>
+        </w:rPr>
+      </w:pPr>
+      <w:r>
+        <w:rPr>
+          <w:lang w:val="pt-PT"/>
+        </w:rPr>
+        <w:t>As contrapartidas obtidas pelo aluguer de equipamento e pela prestação de serviços no âmbito das suas atividades;</w:t>
+      </w:r>
+    </w:p>
+    <w:p>
+      <w:pPr>
+        <w:pStyle w:val="Heading4"/>
+        <w:rPr>
+          <w:lang w:val="pt-PT"/>
+        </w:rPr>
+      </w:pPr>
+      <w:r>
+        <w:rPr>
+          <w:lang w:val="pt-PT"/>
+        </w:rPr>
+        <w:t>Os donativos, subsídios, patrocínios e demais liberalidades que lhe sejam atribuídos;</w:t>
+      </w:r>
+    </w:p>
+    <w:p>
+      <w:pPr>
+        <w:pStyle w:val="Heading4"/>
+        <w:rPr>
+          <w:lang w:val="pt-PT"/>
+        </w:rPr>
+      </w:pPr>
+      <w:r>
+        <w:rPr>
+          <w:lang w:val="pt-PT"/>
+        </w:rPr>
+        <w:t>Quaisquer outras receitas legalmente permitidas.</w:t>
+      </w:r>
+    </w:p>
+    <w:p>
+      <w:pPr>
+        <w:pStyle w:val="Heading2"/>
+        <w:rPr>
+          <w:lang w:val="pt-PT"/>
+        </w:rPr>
+      </w:pPr>
+      <w:r>
+        <w:rPr>
+          <w:lang w:val="pt-PT"/>
+        </w:rPr>
+        <w:br/>
+      </w:r>
+      <w:bookmarkStart w:id="22" w:name="_Toc236000110"/>
+      <w:r>
+        <w:rPr>
+          <w:lang w:val="pt-PT"/>
+        </w:rPr>
+        <w:t>Património e exercício</w:t>
+      </w:r>
+      <w:bookmarkEnd w:id="22"/>
+    </w:p>
+    <w:p>
+      <w:pPr>
+        <w:pStyle w:val="Heading3"/>
+        <w:rPr>
+          <w:lang w:val="pt-PT"/>
+        </w:rPr>
+      </w:pPr>
+      <w:r>
+        <w:rPr>
+          <w:lang w:val="pt-PT"/>
+        </w:rPr>
+        <w:t>O património da Associação é constituído pelos bens e direitos que lhe sejam afetos ou que venha a adquirir.</w:t>
+      </w:r>
+    </w:p>
+    <w:p>
+      <w:pPr>
+        <w:pStyle w:val="Heading3"/>
+        <w:rPr>
+          <w:lang w:val="pt-PT"/>
+        </w:rPr>
+      </w:pPr>
+      <w:r>
+        <w:rPr>
+          <w:lang w:val="pt-PT"/>
+        </w:rPr>
+        <w:t>O exercício económico coincide com o ano civil.</w:t>
+      </w:r>
+    </w:p>
+    <w:p>
+      <w:pPr>
+        <w:pStyle w:val="Heading2"/>
+        <w:spacing w:before="240" w:after="60"/>
+        <w:rPr>
+          <w:lang w:val="pt-PT"/>
+        </w:rPr>
+      </w:pPr>
+      <w:r>
+        <w:rPr>
+          <w:sz w:val="22"/>
+          <w:szCs w:val="22"/>
+          <w:lang w:val="pt-PT"/>
+        </w:rPr>
+        <w:br/>
+      </w:r>
+      <w:bookmarkStart w:id="23" w:name="_Toc236000111"/>
+      <w:r>
+        <w:rPr>
+          <w:sz w:val="22"/>
+          <w:szCs w:val="22"/>
+          <w:lang w:val="pt-PT"/>
+        </w:rPr>
+        <w:t>Dissolução e destino do património</w:t>
+      </w:r>
+      <w:bookmarkEnd w:id="23"/>
+    </w:p>
+    <w:p>
+      <w:pPr>
+        <w:pStyle w:val="Heading3"/>
+        <w:rPr>
+          <w:lang w:val="pt-PT"/>
+        </w:rPr>
+      </w:pPr>
+      <w:r>
+        <w:rPr>
+          <w:lang w:val="pt-PT"/>
+        </w:rPr>
+        <w:t>Dissolvida a Associação, o património remanescente, cumpridas as obrigações legais, é destinado a outra entidade sem fins lucrativos de fins idênticos ou semelhantes, a designar pela Assembleia Geral.</w:t>
+      </w:r>
+    </w:p>
+    <w:p>
+      <w:pPr>
+        <w:pStyle w:val="Heading3"/>
+        <w:rPr>
+          <w:lang w:val="pt-PT"/>
+        </w:rPr>
+      </w:pPr>
+      <w:r>
+        <w:rPr>
+          <w:lang w:val="pt-PT"/>
+        </w:rPr>
+        <w:t>Em nenhum caso o património pode reverter, no todo ou em parte, a favor dos associados.</w:t>
+      </w:r>
+    </w:p>
+    <w:p>
+      <w:pPr>
+        <w:pStyle w:val="Heading1"/>
+        <w:rPr>
+          <w:lang w:val="pt-PT"/>
+        </w:rPr>
+      </w:pPr>
+      <w:bookmarkStart w:id="24" w:name="_Toc236000112"/>
+      <w:r>
+        <w:rPr>
+          <w:lang w:val="pt-PT"/>
+        </w:rPr>
+        <w:t>Disposições Finais</w:t>
+      </w:r>
+      <w:bookmarkEnd w:id="24"/>
+    </w:p>
+    <w:p>
+      <w:pPr>
+        <w:pStyle w:val="Heading2"/>
+        <w:rPr>
+          <w:lang w:val="pt-PT"/>
+        </w:rPr>
+      </w:pPr>
+      <w:r>
+        <w:rPr>
+          <w:lang w:val="pt-PT"/>
+        </w:rPr>
+        <w:br/>
+      </w:r>
+      <w:bookmarkStart w:id="25" w:name="_Toc236000113"/>
+      <w:r>
+        <w:rPr>
+          <w:lang w:val="pt-PT"/>
+        </w:rPr>
+        <w:t>Regulamento interno</w:t>
+      </w:r>
+      <w:bookmarkEnd w:id="25"/>
+    </w:p>
+    <w:p>
+      <w:pPr>
+        <w:pStyle w:val="Heading3"/>
+        <w:rPr>
+          <w:lang w:val="pt-PT"/>
+        </w:rPr>
+      </w:pPr>
+      <w:r>
+        <w:rPr>
+          <w:lang w:val="pt-PT"/>
+        </w:rPr>
+        <w:t>O funcionamento da Associação é complementado por regulamento interno, aprovado e alterado pela Assembleia Geral, que não pode contrariar os presentes estatutos nem a lei.</w:t>
+      </w:r>
+    </w:p>
+    <w:p>
+      <w:pPr>
+        <w:pStyle w:val="Heading2"/>
+        <w:rPr>
+          <w:lang w:val="pt-PT"/>
+        </w:rPr>
+      </w:pPr>
+      <w:r>
+        <w:rPr>
+          <w:lang w:val="pt-PT"/>
+        </w:rPr>
+        <w:br/>
+      </w:r>
+      <w:bookmarkStart w:id="26" w:name="_Toc236000114"/>
+      <w:r>
+        <w:rPr>
+          <w:lang w:val="pt-PT"/>
+        </w:rPr>
+        <w:t>Casos omissos</w:t>
+      </w:r>
+      <w:bookmarkEnd w:id="26"/>
+    </w:p>
+    <w:p>
+      <w:pPr>
+        <w:pStyle w:val="Heading3"/>
+        <w:rPr>
+          <w:lang w:val="pt-PT"/>
+        </w:rPr>
+      </w:pPr>
+      <w:r>
+        <w:rPr>
+          <w:lang w:val="pt-PT"/>
+        </w:rPr>
+        <w:lastRenderedPageBreak/>
+        <w:t>Nos casos omissos aplica-se a lei geral, designadamente o Código Civil.</w:t>
+      </w:r>
+    </w:p>
+    <w:p>
+      <w:pPr>
+        <w:pStyle w:val="Heading3"/>
+        <w:numPr>
+          <w:ilvl w:val="0"/>
+          <w:numId w:val="0"/>
+        </w:numPr>
+        <w:ind w:left="720"/>
+        <w:rPr>
+          <w:lang w:val="pt-PT"/>
+        </w:rPr>
+      </w:pPr>
+    </w:p>
+    <w:p>
+      <w:pPr>
+        <w:pStyle w:val="Heading3"/>
+        <w:numPr>
+          <w:ilvl w:val="0"/>
+          <w:numId w:val="0"/>
+        </w:numPr>
+        <w:ind w:left="720"/>
+        <w:rPr>
+          <w:lang w:val="pt-PT"/>
+        </w:rPr>
+      </w:pPr>
+    </w:p>
+    <w:p>
+      <w:pPr>
+        <w:spacing w:before="320"/>
+        <w:rPr>
+          <w:lang w:val="pt-PT"/>
+        </w:rPr>
+      </w:pPr>
+      <w:r>
+        <w:rPr>
+          <w:lang w:val="pt-PT"/>
+        </w:rPr>
+        <w:t>____________________, ___ de ______________ de 20___</w:t>
+      </w:r>
+    </w:p>
+    <w:p>
+      <w:pPr>
+        <w:spacing w:before="200"/>
+        <w:rPr>
+          <w:lang w:val="pt-PT"/>
+        </w:rPr>
+      </w:pPr>
+      <w:r>
+        <w:rPr>
+          <w:i/>
+          <w:iCs/>
+          <w:color w:val="555555"/>
+          <w:sz w:val="20"/>
+          <w:szCs w:val="20"/>
+          <w:lang w:val="pt-PT"/>
+        </w:rPr>
+        <w:t>(assinaturas dos associados fundadores)</w:t>
+      </w:r>
+    </w:p>
+    <w:p>
+      <w:pPr>
+        <w:rPr>
+          <w:lang w:val="pt-PT"/>
+        </w:rPr>
+      </w:pPr>
+      <w:r>
+        <w:rPr>
+          <w:lang w:val="pt-PT"/>
+        </w:rPr>
+        <w:br w:type="page"/>
       </w:r>
     </w:p>
     <w:sectPr>
@@ -2006,7 +4926,7 @@
 
 <file path=word/comments.xml><?xml version="1.0" encoding="utf-8"?>
 <w:comments xmlns:wpc="http://schemas.microsoft.com/office/word/2010/wordprocessingCanvas" xmlns:cx="http://schemas.microsoft.com/office/drawing/2014/chartex" xmlns:cx1="http://schemas.microsoft.com/office/drawing/2015/9/8/chartex" xmlns:cx2="http://schemas.microsoft.com/office/drawing/2015/10/21/chartex" xmlns:cx3="http://schemas.microsoft.com/office/drawing/2016/5/9/chartex" xmlns:cx4="http://schemas.microsoft.com/office/drawing/2016/5/10/chartex" xmlns:cx5="http://schemas.microsoft.com/office/drawing/2016/5/11/chartex" xmlns:cx6="http://schemas.microsoft.com/office/drawing/2016/5/12/chartex" xmlns:cx7="http://schemas.microsoft.com/office/drawing/2016/5/13/chartex" xmlns:cx8="http://schemas.microsoft.com/office/drawing/2016/5/14/chartex" xmlns:mc="http://schemas.openxmlformats.org/markup-compatibility/2006" xmlns:aink="http://schemas.microsoft.com/office/drawing/2016/ink" xmlns:am3d="http://schemas.microsoft.com/office/drawing/2017/model3d" xmlns:o="urn:schemas-microsoft-com:office:office" xmlns:oel="http://schemas.microsoft.com/office/2019/extlst" xmlns:r="http://schemas.openxmlformats.org/officeDocument/2006/relationships" xmlns:m="http://schemas.openxmlformats.org/officeDocument/2006/math" xmlns:v="urn:schemas-microsoft-com:vml" xmlns:wp14="http://schemas.microsoft.com/office/word/2010/wordprocessingDrawing" xmlns:wp="http://schemas.openxmlformats.org/drawingml/2006/wordprocessingDrawing" xmlns:w10="urn:schemas-microsoft-com:office:word" xmlns:w="http://schemas.openxmlformats.org/wordprocessingml/2006/main" xmlns:w14="http://schemas.microsoft.com/office/word/2010/wordml" xmlns:w15="http://schemas.microsoft.com/office/word/2012/wordml" xmlns:w16cex="http://schemas.microsoft.com/office/word/2018/wordml/cex" xmlns:w16cid="http://schemas.microsoft.com/office/word/2016/wordml/cid" xmlns:w16="http://schemas.microsoft.com/office/word/2018/wordml" xmlns:w16du="http://schemas.microsoft.com/office/word/2023/wordml/word16du" xmlns:w16sdtdh="http://schemas.microsoft.com/office/word/2020/wordml/sdtdatahash" xmlns:w16sdtfl="http://schemas.microsoft.com/office/word/2024/wordml/sdtformatlock" xmlns:w16se="http://schemas.microsoft.com/office/word/2015/wordml/symex" xmlns:wpg="http://schemas.microsoft.com/office/word/2010/wordprocessingGroup" xmlns:wpi="http://schemas.microsoft.com/office/word/2010/wordprocessingInk" xmlns:wne="http://schemas.microsoft.com/office/word/2006/wordml" xmlns:wps="http://schemas.microsoft.com/office/word/2010/wordprocessingShape" mc:Ignorable="w14 w15 w16se w16cid w16 w16cex w16sdtdh w16sdtfl w16du wp14">
-  <w:comment w:id="0" w:author="Rui Cesar Salvado Alves" w:date="2026-07-23T18:48:00Z" w:initials="RA">
+  <w:comment w:id="18" w:author="Rui Cesar Salvado Alves" w:date="2026-07-23T18:48:00Z" w:initials="RA">
     <w:p>
       <w:pPr>
         <w:pStyle w:val="CommentText"/>
@@ -2212,13 +5132,7 @@
                                         <w:fldChar w:fldCharType="end"/>
                                       </w:r>
                                       <w:r>
-                                        <w:t xml:space="preserve"> </w:t>
-                                      </w:r>
-                                      <w:r>
-                                        <w:t>/</w:t>
-                                      </w:r>
-                                      <w:r>
-                                        <w:t xml:space="preserve"> </w:t>
+                                        <w:t xml:space="preserve"> / </w:t>
                                       </w:r>
                                       <w:r>
                                         <w:rPr>
@@ -2411,13 +5325,7 @@
                                   <w:fldChar w:fldCharType="end"/>
                                 </w:r>
                                 <w:r>
-                                  <w:t xml:space="preserve"> </w:t>
-                                </w:r>
-                                <w:r>
-                                  <w:t>/</w:t>
-                                </w:r>
-                                <w:r>
-                                  <w:t xml:space="preserve"> </w:t>
+                                  <w:t xml:space="preserve"> / </w:t>
                                 </w:r>
                                 <w:r>
                                   <w:rPr>
@@ -3476,6 +6384,7 @@
   </w:style>
   <w:style w:type="character" w:customStyle="1" w:styleId="Heading1Char">
     <w:name w:val="Heading 1 Char"/>
+    <w:aliases w:val="8.1 QD HEADING 1 Char"/>
     <w:basedOn w:val="DefaultParagraphFont"/>
     <w:link w:val="Heading1"/>
     <w:uiPriority w:val="9"/>
@@ -3494,6 +6403,7 @@
   </w:style>
   <w:style w:type="character" w:customStyle="1" w:styleId="Heading2Char">
     <w:name w:val="Heading 2 Char"/>
+    <w:aliases w:val="8.2 QD HEADING 2 Char"/>
     <w:basedOn w:val="DefaultParagraphFont"/>
     <w:link w:val="Heading2"/>
     <w:uiPriority w:val="9"/>
@@ -3510,6 +6420,7 @@
   </w:style>
   <w:style w:type="character" w:customStyle="1" w:styleId="Heading3Char">
     <w:name w:val="Heading 3 Char"/>
+    <w:aliases w:val="8.3 QD HEADING 3 Char"/>
     <w:basedOn w:val="DefaultParagraphFont"/>
     <w:link w:val="Heading3"/>
     <w:rsid w:val="00383398"/>
@@ -3669,6 +6580,7 @@
   </w:style>
   <w:style w:type="character" w:customStyle="1" w:styleId="Heading5Char">
     <w:name w:val="Heading 5 Char"/>
+    <w:aliases w:val="8.5 QD HEADING 5 Char"/>
     <w:basedOn w:val="DefaultParagraphFont"/>
     <w:link w:val="Heading5"/>
     <w:uiPriority w:val="9"/>
@@ -3681,6 +6593,7 @@
   </w:style>
   <w:style w:type="character" w:customStyle="1" w:styleId="Heading6Char">
     <w:name w:val="Heading 6 Char"/>
+    <w:aliases w:val="8.6 QD HEADING 6 Char"/>
     <w:basedOn w:val="DefaultParagraphFont"/>
     <w:link w:val="Heading6"/>
     <w:uiPriority w:val="9"/>
@@ -3695,6 +6608,7 @@
   </w:style>
   <w:style w:type="character" w:customStyle="1" w:styleId="Heading7Char">
     <w:name w:val="Heading 7 Char"/>
+    <w:aliases w:val="8.7 QD HEADING 7 Char"/>
     <w:basedOn w:val="DefaultParagraphFont"/>
     <w:link w:val="Heading7"/>
     <w:uiPriority w:val="9"/>
@@ -3707,6 +6621,7 @@
   </w:style>
   <w:style w:type="character" w:customStyle="1" w:styleId="Heading8Char">
     <w:name w:val="Heading 8 Char"/>
+    <w:aliases w:val="8.8 QD HEADING 8 Char"/>
     <w:basedOn w:val="DefaultParagraphFont"/>
     <w:link w:val="Heading8"/>
     <w:uiPriority w:val="9"/>
@@ -3721,6 +6636,7 @@
   </w:style>
   <w:style w:type="character" w:customStyle="1" w:styleId="Heading9Char">
     <w:name w:val="Heading 9 Char"/>
+    <w:aliases w:val="8.9 QD HEADING 9 Char"/>
     <w:basedOn w:val="DefaultParagraphFont"/>
     <w:link w:val="Heading9"/>
     <w:uiPriority w:val="9"/>
@@ -4061,6 +6977,82 @@
       <w:bCs/>
       <w:sz w:val="20"/>
       <w:szCs w:val="20"/>
+    </w:rPr>
+  </w:style>
+  <w:style w:type="paragraph" w:styleId="TOCHeading">
+    <w:name w:val="TOC Heading"/>
+    <w:basedOn w:val="Heading1"/>
+    <w:next w:val="Normal"/>
+    <w:uiPriority w:val="39"/>
+    <w:unhideWhenUsed/>
+    <w:qFormat/>
+    <w:rsid w:val="00F83352"/>
+    <w:pPr>
+      <w:keepNext/>
+      <w:keepLines/>
+      <w:numPr>
+        <w:numId w:val="0"/>
+      </w:numPr>
+      <w:spacing w:before="240" w:after="0" w:line="259" w:lineRule="auto"/>
+      <w:outlineLvl w:val="9"/>
+    </w:pPr>
+    <w:rPr>
+      <w:rFonts w:asciiTheme="majorHAnsi" w:eastAsiaTheme="majorEastAsia" w:hAnsiTheme="majorHAnsi" w:cstheme="majorBidi"/>
+      <w:b w:val="0"/>
+      <w:bCs w:val="0"/>
+      <w:color w:val="0F4761" w:themeColor="accent1" w:themeShade="BF"/>
+      <w:sz w:val="32"/>
+      <w:szCs w:val="32"/>
+      <w:lang w:val="en-US" w:eastAsia="en-US"/>
+    </w:rPr>
+  </w:style>
+  <w:style w:type="paragraph" w:styleId="TOC1">
+    <w:name w:val="toc 1"/>
+    <w:basedOn w:val="Normal"/>
+    <w:next w:val="Normal"/>
+    <w:autoRedefine/>
+    <w:uiPriority w:val="39"/>
+    <w:unhideWhenUsed/>
+    <w:rsid w:val="00F83352"/>
+    <w:pPr>
+      <w:spacing w:after="100"/>
+    </w:pPr>
+  </w:style>
+  <w:style w:type="paragraph" w:styleId="TOC2">
+    <w:name w:val="toc 2"/>
+    <w:basedOn w:val="Normal"/>
+    <w:next w:val="Normal"/>
+    <w:autoRedefine/>
+    <w:uiPriority w:val="39"/>
+    <w:unhideWhenUsed/>
+    <w:rsid w:val="00F83352"/>
+    <w:pPr>
+      <w:spacing w:after="100"/>
+      <w:ind w:left="240"/>
+    </w:pPr>
+  </w:style>
+  <w:style w:type="paragraph" w:styleId="TOC3">
+    <w:name w:val="toc 3"/>
+    <w:basedOn w:val="Normal"/>
+    <w:next w:val="Normal"/>
+    <w:autoRedefine/>
+    <w:uiPriority w:val="39"/>
+    <w:unhideWhenUsed/>
+    <w:rsid w:val="00F83352"/>
+    <w:pPr>
+      <w:spacing w:after="100"/>
+      <w:ind w:left="480"/>
+    </w:pPr>
+  </w:style>
+  <w:style w:type="character" w:styleId="Hyperlink">
+    <w:name w:val="Hyperlink"/>
+    <w:basedOn w:val="DefaultParagraphFont"/>
+    <w:uiPriority w:val="99"/>
+    <w:unhideWhenUsed/>
+    <w:rsid w:val="00F83352"/>
+    <w:rPr>
+      <w:color w:val="467886" w:themeColor="hyperlink"/>
+      <w:u w:val="single"/>
     </w:rPr>
   </w:style>
 </w:styles>

</xml_diff>